<commit_message>
Aprimora geração das matrizes de auditoria
</commit_message>
<xml_diff>
--- a/02-Execucao/04-Matriz_Achados/AN06 – Matriz de achados.docx
+++ b/02-Execucao/04-Matriz_Achados/AN06 – Matriz de achados.docx
@@ -500,6 +500,186 @@
               <w:t xml:space="preserve"> para a obtenção de melhores resultados, a área de TIC de cada órgão ou entidade deve, preferencialmente, estar vinculada à alta administração, com o intuito de apoiá-la na tomada de decisões e no alcance dos objetivos estratégicos.</w:t>
             </w:r>
           </w:p>
+          <w:p>
+            <w:pPr>
+              <w:jc w:val="both"/>
+              <w:rPr>
+                <w:rFonts w:ascii="Arial" w:eastAsia="Arial" w:hAnsi="Arial" w:cs="Arial"/>
+                <w:b/>
+                <w:bCs/>
+                <w:sz w:val="18"/>
+                <w:szCs w:val="18"/>
+              </w:rPr>
+            </w:pPr>
+          </w:p>
+          <w:p>
+            <w:pPr>
+              <w:jc w:val="both"/>
+              <w:rPr>
+                <w:rFonts w:ascii="Arial" w:hAnsi="Arial" w:cs="Arial"/>
+                <w:sz w:val="18"/>
+                <w:szCs w:val="18"/>
+                <w:vertAlign w:val="superscript"/>
+              </w:rPr>
+            </w:pPr>
+            <w:r>
+              <w:rPr>
+                <w:rFonts w:ascii="Arial" w:hAnsi="Arial" w:cs="Arial"/>
+                <w:b/>
+                <w:sz w:val="18"/>
+                <w:szCs w:val="18"/>
+              </w:rPr>
+              <w:t>Poder Executivo Estadual</w:t>
+            </w:r>
+          </w:p>
+          <w:p>
+            <w:pPr>
+              <w:jc w:val="both"/>
+              <w:rPr>
+                <w:rFonts w:ascii="Arial" w:hAnsi="Arial" w:cs="Arial"/>
+                <w:sz w:val="18"/>
+                <w:szCs w:val="18"/>
+                <w:vertAlign w:val="superscript"/>
+              </w:rPr>
+            </w:pPr>
+            <w:r>
+              <w:rPr>
+                <w:rFonts w:ascii="Arial" w:hAnsi="Arial" w:cs="Arial"/>
+                <w:b/>
+                <w:sz w:val="18"/>
+                <w:szCs w:val="18"/>
+              </w:rPr>
+              <w:t>C8:</w:t>
+            </w:r>
+            <w:r>
+              <w:rPr>
+                <w:rFonts w:ascii="Arial" w:hAnsi="Arial" w:cs="Arial"/>
+                <w:sz w:val="18"/>
+                <w:szCs w:val="18"/>
+              </w:rPr>
+              <w:t xml:space="preserve"> Decreto Estadual nº 47.278/2020 (alterado pelo Decreto nº 48.997/2024), arts. 4º e 6º, I a XI, e Portaria PRODERJ/PRE nº 825/2021, Anexo A, arts. 1º, IX, 8º e 9º — estruturação obrigatória do Sistema Estadual de TIC (SETIC), instituição dos Níveis Setoriais de TIC (NSTIC) e definição das atribuições mínimas da unidade de TIC nos órgãos e entidades do Poder Executivo Estadual.</w:t>
+            </w:r>
+          </w:p>
+          <w:p>
+            <w:pPr>
+              <w:jc w:val="both"/>
+              <w:rPr>
+                <w:rFonts w:ascii="Arial" w:eastAsia="Arial" w:hAnsi="Arial" w:cs="Arial"/>
+                <w:b/>
+                <w:bCs/>
+                <w:sz w:val="18"/>
+                <w:szCs w:val="18"/>
+              </w:rPr>
+            </w:pPr>
+          </w:p>
+          <w:p>
+            <w:pPr>
+              <w:jc w:val="both"/>
+              <w:rPr>
+                <w:rFonts w:ascii="Arial" w:hAnsi="Arial" w:cs="Arial"/>
+                <w:sz w:val="18"/>
+                <w:szCs w:val="18"/>
+                <w:vertAlign w:val="superscript"/>
+              </w:rPr>
+            </w:pPr>
+            <w:r>
+              <w:rPr>
+                <w:rFonts w:ascii="Arial" w:hAnsi="Arial" w:cs="Arial"/>
+                <w:b/>
+                <w:sz w:val="18"/>
+                <w:szCs w:val="18"/>
+              </w:rPr>
+              <w:t>Poder Judiciário Estadual</w:t>
+            </w:r>
+          </w:p>
+          <w:p>
+            <w:pPr>
+              <w:jc w:val="both"/>
+              <w:rPr>
+                <w:rFonts w:ascii="Arial" w:hAnsi="Arial" w:cs="Arial"/>
+                <w:sz w:val="18"/>
+                <w:szCs w:val="18"/>
+                <w:vertAlign w:val="superscript"/>
+              </w:rPr>
+            </w:pPr>
+            <w:r>
+              <w:rPr>
+                <w:rFonts w:ascii="Arial" w:hAnsi="Arial" w:cs="Arial"/>
+                <w:b/>
+                <w:sz w:val="18"/>
+                <w:szCs w:val="18"/>
+              </w:rPr>
+              <w:t>C9:</w:t>
+            </w:r>
+            <w:r>
+              <w:rPr>
+                <w:rFonts w:ascii="Arial" w:hAnsi="Arial" w:cs="Arial"/>
+                <w:sz w:val="18"/>
+                <w:szCs w:val="18"/>
+              </w:rPr>
+              <w:t xml:space="preserve"> Resolução CNJ nº 370/2021, arts. 21 a 23 e Ato Normativo TJ nº 32/2023, arts. 3º e 8º a 10 — dever de estruturação organizacional formal de TIC, com definição de atribuições regimentais e posicionamento compatível no Poder Judiciário Estadual.</w:t>
+            </w:r>
+          </w:p>
+          <w:p>
+            <w:pPr>
+              <w:jc w:val="both"/>
+              <w:rPr>
+                <w:rFonts w:ascii="Arial" w:eastAsia="Arial" w:hAnsi="Arial" w:cs="Arial"/>
+                <w:b/>
+                <w:bCs/>
+                <w:sz w:val="18"/>
+                <w:szCs w:val="18"/>
+              </w:rPr>
+            </w:pPr>
+          </w:p>
+          <w:p>
+            <w:pPr>
+              <w:jc w:val="both"/>
+              <w:rPr>
+                <w:rFonts w:ascii="Arial" w:hAnsi="Arial" w:cs="Arial"/>
+                <w:sz w:val="18"/>
+                <w:szCs w:val="18"/>
+                <w:vertAlign w:val="superscript"/>
+              </w:rPr>
+            </w:pPr>
+            <w:r>
+              <w:rPr>
+                <w:rFonts w:ascii="Arial" w:hAnsi="Arial" w:cs="Arial"/>
+                <w:b/>
+                <w:sz w:val="18"/>
+                <w:szCs w:val="18"/>
+              </w:rPr>
+              <w:t>Ministério Público Estadual</w:t>
+            </w:r>
+          </w:p>
+          <w:p>
+            <w:pPr>
+              <w:jc w:val="both"/>
+              <w:rPr>
+                <w:rFonts w:ascii="Arial" w:hAnsi="Arial" w:cs="Arial"/>
+                <w:sz w:val="18"/>
+                <w:szCs w:val="18"/>
+                <w:vertAlign w:val="superscript"/>
+              </w:rPr>
+            </w:pPr>
+            <w:r>
+              <w:rPr>
+                <w:rFonts w:ascii="Arial" w:hAnsi="Arial" w:cs="Arial"/>
+                <w:b/>
+                <w:sz w:val="18"/>
+                <w:szCs w:val="18"/>
+              </w:rPr>
+              <w:t>C10:</w:t>
+            </w:r>
+            <w:r>
+              <w:rPr>
+                <w:rFonts w:ascii="Arial" w:hAnsi="Arial" w:cs="Arial"/>
+                <w:sz w:val="18"/>
+                <w:szCs w:val="18"/>
+              </w:rPr>
+              <w:t xml:space="preserve"> Resolução CNMP nº 171/2017, arts. 9º, 16, 18 e 33 e Resoluções GPGJ nº 2.675/2025 e nº 2.785/2026, arts. 7º a 10 e 13 — instituição formal da unidade de TIC, atribuições de gestão e posicionamento estratégico subordinado à alta administração no Ministério Público Estadual.</w:t>
+            </w:r>
+          </w:p>
         </w:tc>
         <w:tc>
           <w:tcPr>
@@ -822,6 +1002,93 @@
                 <w:szCs w:val="18"/>
                 <w:u w:val="single"/>
               </w:rPr>
+              <w:t>Poder Executivo Estadual</w:t>
+            </w:r>
+            <w:r>
+              <w:rPr>
+                <w:rFonts w:ascii="Arial" w:hAnsi="Arial" w:cs="Arial"/>
+                <w:sz w:val="18"/>
+                <w:szCs w:val="18"/>
+              </w:rPr>
+              <w:t xml:space="preserve"> — Determinação para que formalize a área, unidade, setor ou função de TIC em instrumento compatível com a organização, definindo vinculação e responsabilidades essenciais de modo compatível com o porte, a complexidade e a dependência tecnológica da organização [S1.1].</w:t>
+            </w:r>
+          </w:p>
+          <w:p>
+            <w:pPr>
+              <w:jc w:val="both"/>
+              <w:rPr>
+                <w:rFonts w:ascii="Arial" w:hAnsi="Arial" w:cs="Arial"/>
+                <w:sz w:val="18"/>
+                <w:szCs w:val="18"/>
+              </w:rPr>
+            </w:pPr>
+            <w:r>
+              <w:rPr>
+                <w:rFonts w:ascii="Arial" w:hAnsi="Arial" w:cs="Arial"/>
+                <w:b/>
+                <w:bCs/>
+                <w:sz w:val="18"/>
+                <w:szCs w:val="18"/>
+                <w:u w:val="single"/>
+              </w:rPr>
+              <w:t>Poder Judiciário Estadual</w:t>
+            </w:r>
+            <w:r>
+              <w:rPr>
+                <w:rFonts w:ascii="Arial" w:hAnsi="Arial" w:cs="Arial"/>
+                <w:sz w:val="18"/>
+                <w:szCs w:val="18"/>
+              </w:rPr>
+              <w:t xml:space="preserve"> — Determinação para que formalize a área, unidade, setor ou função de TIC em instrumento compatível com a organização, definindo vinculação e responsabilidades essenciais de modo compatível com o porte, a complexidade e a dependência tecnológica da organização [S1.1].</w:t>
+            </w:r>
+          </w:p>
+          <w:p>
+            <w:pPr>
+              <w:jc w:val="both"/>
+              <w:rPr>
+                <w:rFonts w:ascii="Arial" w:hAnsi="Arial" w:cs="Arial"/>
+                <w:sz w:val="18"/>
+                <w:szCs w:val="18"/>
+              </w:rPr>
+            </w:pPr>
+            <w:r>
+              <w:rPr>
+                <w:rFonts w:ascii="Arial" w:hAnsi="Arial" w:cs="Arial"/>
+                <w:b/>
+                <w:bCs/>
+                <w:sz w:val="18"/>
+                <w:szCs w:val="18"/>
+                <w:u w:val="single"/>
+              </w:rPr>
+              <w:t>Ministério Público Estadual</w:t>
+            </w:r>
+            <w:r>
+              <w:rPr>
+                <w:rFonts w:ascii="Arial" w:hAnsi="Arial" w:cs="Arial"/>
+                <w:sz w:val="18"/>
+                <w:szCs w:val="18"/>
+              </w:rPr>
+              <w:t xml:space="preserve"> — Determinação para que formalize a área, unidade, setor ou função de TIC em instrumento compatível com a organização, definindo vinculação e responsabilidades essenciais de modo compatível com o porte, a complexidade e a dependência tecnológica da organização [S1.1].</w:t>
+            </w:r>
+          </w:p>
+          <w:p>
+            <w:pPr>
+              <w:jc w:val="both"/>
+              <w:rPr>
+                <w:rFonts w:ascii="Arial" w:hAnsi="Arial" w:cs="Arial"/>
+                <w:sz w:val="18"/>
+                <w:szCs w:val="18"/>
+              </w:rPr>
+            </w:pPr>
+            <w:r>
+              <w:rPr>
+                <w:rFonts w:ascii="Arial" w:hAnsi="Arial" w:cs="Arial"/>
+                <w:b/>
+                <w:bCs/>
+                <w:sz w:val="18"/>
+                <w:szCs w:val="18"/>
+                <w:u w:val="single"/>
+              </w:rPr>
               <w:t>Comunicação com Recomendação</w:t>
             </w:r>
             <w:r>
@@ -864,6 +1131,93 @@
                 <w:szCs w:val="18"/>
                 <w:u w:val="single"/>
               </w:rPr>
+              <w:t>Poder Executivo Estadual</w:t>
+            </w:r>
+            <w:r>
+              <w:rPr>
+                <w:rFonts w:ascii="Arial" w:hAnsi="Arial" w:cs="Arial"/>
+                <w:sz w:val="18"/>
+                <w:szCs w:val="18"/>
+              </w:rPr>
+              <w:t xml:space="preserve"> — Determinação para que defina formalmente as atribuições da área de TIC, atentando-se, minimamente, em abranger as atividades de planejamento, coordenação, gestão e controle da TIC [S1.2].</w:t>
+            </w:r>
+          </w:p>
+          <w:p>
+            <w:pPr>
+              <w:jc w:val="both"/>
+              <w:rPr>
+                <w:rFonts w:ascii="Arial" w:hAnsi="Arial" w:cs="Arial"/>
+                <w:sz w:val="18"/>
+                <w:szCs w:val="18"/>
+              </w:rPr>
+            </w:pPr>
+            <w:r>
+              <w:rPr>
+                <w:rFonts w:ascii="Arial" w:hAnsi="Arial" w:cs="Arial"/>
+                <w:b/>
+                <w:bCs/>
+                <w:sz w:val="18"/>
+                <w:szCs w:val="18"/>
+                <w:u w:val="single"/>
+              </w:rPr>
+              <w:t>Poder Judiciário Estadual</w:t>
+            </w:r>
+            <w:r>
+              <w:rPr>
+                <w:rFonts w:ascii="Arial" w:hAnsi="Arial" w:cs="Arial"/>
+                <w:sz w:val="18"/>
+                <w:szCs w:val="18"/>
+              </w:rPr>
+              <w:t xml:space="preserve"> — Determinação para que defina formalmente as atribuições da área de TIC, atentando-se, minimamente, em abranger as atividades de planejamento, coordenação, gestão e controle da TIC [S1.2].</w:t>
+            </w:r>
+          </w:p>
+          <w:p>
+            <w:pPr>
+              <w:jc w:val="both"/>
+              <w:rPr>
+                <w:rFonts w:ascii="Arial" w:hAnsi="Arial" w:cs="Arial"/>
+                <w:sz w:val="18"/>
+                <w:szCs w:val="18"/>
+              </w:rPr>
+            </w:pPr>
+            <w:r>
+              <w:rPr>
+                <w:rFonts w:ascii="Arial" w:hAnsi="Arial" w:cs="Arial"/>
+                <w:b/>
+                <w:bCs/>
+                <w:sz w:val="18"/>
+                <w:szCs w:val="18"/>
+                <w:u w:val="single"/>
+              </w:rPr>
+              <w:t>Ministério Público Estadual</w:t>
+            </w:r>
+            <w:r>
+              <w:rPr>
+                <w:rFonts w:ascii="Arial" w:hAnsi="Arial" w:cs="Arial"/>
+                <w:sz w:val="18"/>
+                <w:szCs w:val="18"/>
+              </w:rPr>
+              <w:t xml:space="preserve"> — Determinação para que defina formalmente as atribuições da área de TIC, atentando-se, minimamente, em abranger as atividades de planejamento, coordenação, gestão e controle da TIC [S1.2].</w:t>
+            </w:r>
+          </w:p>
+          <w:p>
+            <w:pPr>
+              <w:jc w:val="both"/>
+              <w:rPr>
+                <w:rFonts w:ascii="Arial" w:hAnsi="Arial" w:cs="Arial"/>
+                <w:sz w:val="18"/>
+                <w:szCs w:val="18"/>
+              </w:rPr>
+            </w:pPr>
+            <w:r>
+              <w:rPr>
+                <w:rFonts w:ascii="Arial" w:hAnsi="Arial" w:cs="Arial"/>
+                <w:b/>
+                <w:bCs/>
+                <w:sz w:val="18"/>
+                <w:szCs w:val="18"/>
+                <w:u w:val="single"/>
+              </w:rPr>
               <w:t>Comunicação com Recomendação</w:t>
             </w:r>
             <w:r>
@@ -873,6 +1227,93 @@
                 <w:szCs w:val="18"/>
               </w:rPr>
               <w:t xml:space="preserve"> para que avalie o posicionamento organizacional da área de TIC e adote, quando necessário, medidas para assegurar interlocução adequada com a alta administração e participação nas decisões estratégicas, orçamentárias, contratuais e de gestão de riscos relacionadas à tecnologia da informação [S1.3].</w:t>
+            </w:r>
+          </w:p>
+          <w:p>
+            <w:pPr>
+              <w:jc w:val="both"/>
+              <w:rPr>
+                <w:rFonts w:ascii="Arial" w:hAnsi="Arial" w:cs="Arial"/>
+                <w:sz w:val="18"/>
+                <w:szCs w:val="18"/>
+              </w:rPr>
+            </w:pPr>
+            <w:r>
+              <w:rPr>
+                <w:rFonts w:ascii="Arial" w:hAnsi="Arial" w:cs="Arial"/>
+                <w:b/>
+                <w:bCs/>
+                <w:sz w:val="18"/>
+                <w:szCs w:val="18"/>
+                <w:u w:val="single"/>
+              </w:rPr>
+              <w:t>Poder Executivo Estadual</w:t>
+            </w:r>
+            <w:r>
+              <w:rPr>
+                <w:rFonts w:ascii="Arial" w:hAnsi="Arial" w:cs="Arial"/>
+                <w:sz w:val="18"/>
+                <w:szCs w:val="18"/>
+              </w:rPr>
+              <w:t xml:space="preserve"> — Recomendação para que avalie o posicionamento organizacional da área de TIC e adote, quando necessário, medidas para assegurar interlocução adequada com a alta administração e participação nas decisões estratégicas, orçamentárias, contratuais e de gestão de riscos relacionadas à tecnologia da informação [S1.3].</w:t>
+            </w:r>
+          </w:p>
+          <w:p>
+            <w:pPr>
+              <w:jc w:val="both"/>
+              <w:rPr>
+                <w:rFonts w:ascii="Arial" w:hAnsi="Arial" w:cs="Arial"/>
+                <w:sz w:val="18"/>
+                <w:szCs w:val="18"/>
+              </w:rPr>
+            </w:pPr>
+            <w:r>
+              <w:rPr>
+                <w:rFonts w:ascii="Arial" w:hAnsi="Arial" w:cs="Arial"/>
+                <w:b/>
+                <w:bCs/>
+                <w:sz w:val="18"/>
+                <w:szCs w:val="18"/>
+                <w:u w:val="single"/>
+              </w:rPr>
+              <w:t>Poder Judiciário Estadual</w:t>
+            </w:r>
+            <w:r>
+              <w:rPr>
+                <w:rFonts w:ascii="Arial" w:hAnsi="Arial" w:cs="Arial"/>
+                <w:sz w:val="18"/>
+                <w:szCs w:val="18"/>
+              </w:rPr>
+              <w:t xml:space="preserve"> — Recomendação para que avalie o posicionamento organizacional da área de TIC e adote, quando necessário, medidas para assegurar interlocução adequada com a alta administração e participação nas decisões estratégicas, orçamentárias, contratuais e de gestão de riscos relacionadas à tecnologia da informação [S1.3].</w:t>
+            </w:r>
+          </w:p>
+          <w:p>
+            <w:pPr>
+              <w:jc w:val="both"/>
+              <w:rPr>
+                <w:rFonts w:ascii="Arial" w:hAnsi="Arial" w:cs="Arial"/>
+                <w:sz w:val="18"/>
+                <w:szCs w:val="18"/>
+              </w:rPr>
+            </w:pPr>
+            <w:r>
+              <w:rPr>
+                <w:rFonts w:ascii="Arial" w:hAnsi="Arial" w:cs="Arial"/>
+                <w:b/>
+                <w:bCs/>
+                <w:sz w:val="18"/>
+                <w:szCs w:val="18"/>
+                <w:u w:val="single"/>
+              </w:rPr>
+              <w:t>Ministério Público Estadual</w:t>
+            </w:r>
+            <w:r>
+              <w:rPr>
+                <w:rFonts w:ascii="Arial" w:hAnsi="Arial" w:cs="Arial"/>
+                <w:sz w:val="18"/>
+                <w:szCs w:val="18"/>
+              </w:rPr>
+              <w:t xml:space="preserve"> — Recomendação para que avalie o posicionamento organizacional da área de TIC e adote, quando necessário, medidas para assegurar interlocução adequada com a alta administração e participação nas decisões estratégicas, orçamentárias, contratuais e de gestão de riscos relacionadas à tecnologia da informação [S1.3].</w:t>
             </w:r>
           </w:p>
         </w:tc>
@@ -1313,6 +1754,186 @@
               <w:t/>
             </w:r>
           </w:p>
+          <w:p>
+            <w:pPr>
+              <w:jc w:val="both"/>
+              <w:rPr>
+                <w:rFonts w:ascii="Arial" w:eastAsia="Arial" w:hAnsi="Arial" w:cs="Arial"/>
+                <w:b/>
+                <w:bCs/>
+                <w:sz w:val="18"/>
+                <w:szCs w:val="18"/>
+              </w:rPr>
+            </w:pPr>
+          </w:p>
+          <w:p>
+            <w:pPr>
+              <w:jc w:val="both"/>
+              <w:rPr>
+                <w:rFonts w:ascii="Arial" w:hAnsi="Arial" w:cs="Arial"/>
+                <w:sz w:val="18"/>
+                <w:szCs w:val="18"/>
+                <w:vertAlign w:val="superscript"/>
+              </w:rPr>
+            </w:pPr>
+            <w:r>
+              <w:rPr>
+                <w:rFonts w:ascii="Arial" w:hAnsi="Arial" w:cs="Arial"/>
+                <w:b/>
+                <w:sz w:val="18"/>
+                <w:szCs w:val="18"/>
+              </w:rPr>
+              <w:t>Poder Executivo Estadual</w:t>
+            </w:r>
+          </w:p>
+          <w:p>
+            <w:pPr>
+              <w:jc w:val="both"/>
+              <w:rPr>
+                <w:rFonts w:ascii="Arial" w:hAnsi="Arial" w:cs="Arial"/>
+                <w:sz w:val="18"/>
+                <w:szCs w:val="18"/>
+                <w:vertAlign w:val="superscript"/>
+              </w:rPr>
+            </w:pPr>
+            <w:r>
+              <w:rPr>
+                <w:rFonts w:ascii="Arial" w:hAnsi="Arial" w:cs="Arial"/>
+                <w:b/>
+                <w:sz w:val="18"/>
+                <w:szCs w:val="18"/>
+              </w:rPr>
+              <w:t>C5:</w:t>
+            </w:r>
+            <w:r>
+              <w:rPr>
+                <w:rFonts w:ascii="Arial" w:hAnsi="Arial" w:cs="Arial"/>
+                <w:sz w:val="18"/>
+                <w:szCs w:val="18"/>
+              </w:rPr>
+              <w:t xml:space="preserve"> Portaria PRODERJ/PRE nº 825/2021, Anexo C, arts. 2º, 5º, 6º, 13 e 14 e Decreto Estadual nº 46.644/2019, arts. 3º e 4º — instituição obrigatória do Comitê Permanente do PEDTIC com composição multidisciplinar, definição de metas, indicadores e registros formais das deliberações no Poder Executivo Estadual.</w:t>
+            </w:r>
+          </w:p>
+          <w:p>
+            <w:pPr>
+              <w:jc w:val="both"/>
+              <w:rPr>
+                <w:rFonts w:ascii="Arial" w:eastAsia="Arial" w:hAnsi="Arial" w:cs="Arial"/>
+                <w:b/>
+                <w:bCs/>
+                <w:sz w:val="18"/>
+                <w:szCs w:val="18"/>
+              </w:rPr>
+            </w:pPr>
+          </w:p>
+          <w:p>
+            <w:pPr>
+              <w:jc w:val="both"/>
+              <w:rPr>
+                <w:rFonts w:ascii="Arial" w:hAnsi="Arial" w:cs="Arial"/>
+                <w:sz w:val="18"/>
+                <w:szCs w:val="18"/>
+                <w:vertAlign w:val="superscript"/>
+              </w:rPr>
+            </w:pPr>
+            <w:r>
+              <w:rPr>
+                <w:rFonts w:ascii="Arial" w:hAnsi="Arial" w:cs="Arial"/>
+                <w:b/>
+                <w:sz w:val="18"/>
+                <w:szCs w:val="18"/>
+              </w:rPr>
+              <w:t>Poder Judiciário Estadual</w:t>
+            </w:r>
+          </w:p>
+          <w:p>
+            <w:pPr>
+              <w:jc w:val="both"/>
+              <w:rPr>
+                <w:rFonts w:ascii="Arial" w:hAnsi="Arial" w:cs="Arial"/>
+                <w:sz w:val="18"/>
+                <w:szCs w:val="18"/>
+                <w:vertAlign w:val="superscript"/>
+              </w:rPr>
+            </w:pPr>
+            <w:r>
+              <w:rPr>
+                <w:rFonts w:ascii="Arial" w:hAnsi="Arial" w:cs="Arial"/>
+                <w:b/>
+                <w:sz w:val="18"/>
+                <w:szCs w:val="18"/>
+              </w:rPr>
+              <w:t>C6:</w:t>
+            </w:r>
+            <w:r>
+              <w:rPr>
+                <w:rFonts w:ascii="Arial" w:hAnsi="Arial" w:cs="Arial"/>
+                <w:sz w:val="18"/>
+                <w:szCs w:val="18"/>
+              </w:rPr>
+              <w:t xml:space="preserve"> Resolução CNJ nº 370/2021, arts. 7º, 8º, 42, 44, 46 e 48 e Atos Normativos TJ nº 27/2022 e nº 32/2023 — instituição obrigatória do Comitê de Governança de TIC (CGTIC), metas, indicadores estratégicos e reuniões periódicas no Poder Judiciário Estadual.</w:t>
+            </w:r>
+          </w:p>
+          <w:p>
+            <w:pPr>
+              <w:jc w:val="both"/>
+              <w:rPr>
+                <w:rFonts w:ascii="Arial" w:eastAsia="Arial" w:hAnsi="Arial" w:cs="Arial"/>
+                <w:b/>
+                <w:bCs/>
+                <w:sz w:val="18"/>
+                <w:szCs w:val="18"/>
+              </w:rPr>
+            </w:pPr>
+          </w:p>
+          <w:p>
+            <w:pPr>
+              <w:jc w:val="both"/>
+              <w:rPr>
+                <w:rFonts w:ascii="Arial" w:hAnsi="Arial" w:cs="Arial"/>
+                <w:sz w:val="18"/>
+                <w:szCs w:val="18"/>
+                <w:vertAlign w:val="superscript"/>
+              </w:rPr>
+            </w:pPr>
+            <w:r>
+              <w:rPr>
+                <w:rFonts w:ascii="Arial" w:hAnsi="Arial" w:cs="Arial"/>
+                <w:b/>
+                <w:sz w:val="18"/>
+                <w:szCs w:val="18"/>
+              </w:rPr>
+              <w:t>Ministério Público Estadual</w:t>
+            </w:r>
+          </w:p>
+          <w:p>
+            <w:pPr>
+              <w:jc w:val="both"/>
+              <w:rPr>
+                <w:rFonts w:ascii="Arial" w:hAnsi="Arial" w:cs="Arial"/>
+                <w:sz w:val="18"/>
+                <w:szCs w:val="18"/>
+                <w:vertAlign w:val="superscript"/>
+              </w:rPr>
+            </w:pPr>
+            <w:r>
+              <w:rPr>
+                <w:rFonts w:ascii="Arial" w:hAnsi="Arial" w:cs="Arial"/>
+                <w:b/>
+                <w:sz w:val="18"/>
+                <w:szCs w:val="18"/>
+              </w:rPr>
+              <w:t>C7:</w:t>
+            </w:r>
+            <w:r>
+              <w:rPr>
+                <w:rFonts w:ascii="Arial" w:hAnsi="Arial" w:cs="Arial"/>
+                <w:sz w:val="18"/>
+                <w:szCs w:val="18"/>
+              </w:rPr>
+              <w:t xml:space="preserve"> Resolução CNMP nº 171/2017, arts. 11 a 14 e Resoluções GPGJ nº 2.540/2023 e nº 2.785/2026 — instituição obrigatória do Comitê Estratégico de TI (CETI), metas, reuniões trimestrais e relatório anual no Ministério Público Estadual.</w:t>
+            </w:r>
+          </w:p>
         </w:tc>
         <w:tc>
           <w:tcPr>
@@ -1635,6 +2256,93 @@
                 <w:szCs w:val="18"/>
                 <w:u w:val="single"/>
               </w:rPr>
+              <w:t>Poder Executivo Estadual</w:t>
+            </w:r>
+            <w:r>
+              <w:rPr>
+                <w:rFonts w:ascii="Arial" w:hAnsi="Arial" w:cs="Arial"/>
+                <w:sz w:val="18"/>
+                <w:szCs w:val="18"/>
+              </w:rPr>
+              <w:t xml:space="preserve"> — Recomendação para que estabeleça objetivos, indicadores e metas para a gestão de TIC, de modo a possibilitar o acompanhamento periódico do desempenho da TIC pela alta administração [S2.1].</w:t>
+            </w:r>
+          </w:p>
+          <w:p>
+            <w:pPr>
+              <w:jc w:val="both"/>
+              <w:rPr>
+                <w:rFonts w:ascii="Arial" w:hAnsi="Arial" w:cs="Arial"/>
+                <w:sz w:val="18"/>
+                <w:szCs w:val="18"/>
+              </w:rPr>
+            </w:pPr>
+            <w:r>
+              <w:rPr>
+                <w:rFonts w:ascii="Arial" w:hAnsi="Arial" w:cs="Arial"/>
+                <w:b/>
+                <w:bCs/>
+                <w:sz w:val="18"/>
+                <w:szCs w:val="18"/>
+                <w:u w:val="single"/>
+              </w:rPr>
+              <w:t>Poder Judiciário Estadual</w:t>
+            </w:r>
+            <w:r>
+              <w:rPr>
+                <w:rFonts w:ascii="Arial" w:hAnsi="Arial" w:cs="Arial"/>
+                <w:sz w:val="18"/>
+                <w:szCs w:val="18"/>
+              </w:rPr>
+              <w:t xml:space="preserve"> — Determinação para que estabeleça objetivos, indicadores e metas para a gestão de TIC, de modo a possibilitar o acompanhamento periódico do desempenho da TIC pela alta administração [S2.1].</w:t>
+            </w:r>
+          </w:p>
+          <w:p>
+            <w:pPr>
+              <w:jc w:val="both"/>
+              <w:rPr>
+                <w:rFonts w:ascii="Arial" w:hAnsi="Arial" w:cs="Arial"/>
+                <w:sz w:val="18"/>
+                <w:szCs w:val="18"/>
+              </w:rPr>
+            </w:pPr>
+            <w:r>
+              <w:rPr>
+                <w:rFonts w:ascii="Arial" w:hAnsi="Arial" w:cs="Arial"/>
+                <w:b/>
+                <w:bCs/>
+                <w:sz w:val="18"/>
+                <w:szCs w:val="18"/>
+                <w:u w:val="single"/>
+              </w:rPr>
+              <w:t>Ministério Público Estadual</w:t>
+            </w:r>
+            <w:r>
+              <w:rPr>
+                <w:rFonts w:ascii="Arial" w:hAnsi="Arial" w:cs="Arial"/>
+                <w:sz w:val="18"/>
+                <w:szCs w:val="18"/>
+              </w:rPr>
+              <w:t xml:space="preserve"> — Determinação para que estabeleça objetivos, indicadores e metas para a gestão de TIC, de modo a possibilitar o acompanhamento periódico do desempenho da TIC pela alta administração [S2.1].</w:t>
+            </w:r>
+          </w:p>
+          <w:p>
+            <w:pPr>
+              <w:jc w:val="both"/>
+              <w:rPr>
+                <w:rFonts w:ascii="Arial" w:hAnsi="Arial" w:cs="Arial"/>
+                <w:sz w:val="18"/>
+                <w:szCs w:val="18"/>
+              </w:rPr>
+            </w:pPr>
+            <w:r>
+              <w:rPr>
+                <w:rFonts w:ascii="Arial" w:hAnsi="Arial" w:cs="Arial"/>
+                <w:b/>
+                <w:bCs/>
+                <w:sz w:val="18"/>
+                <w:szCs w:val="18"/>
+                <w:u w:val="single"/>
+              </w:rPr>
               <w:t>Comunicação com Determinação</w:t>
             </w:r>
             <w:r>
@@ -1677,6 +2385,93 @@
                 <w:szCs w:val="18"/>
                 <w:u w:val="single"/>
               </w:rPr>
+              <w:t>Poder Executivo Estadual</w:t>
+            </w:r>
+            <w:r>
+              <w:rPr>
+                <w:rFonts w:ascii="Arial" w:hAnsi="Arial" w:cs="Arial"/>
+                <w:sz w:val="18"/>
+                <w:szCs w:val="18"/>
+              </w:rPr>
+              <w:t xml:space="preserve"> — Determinação para que institua formalmente Comitê de TIC ou instância colegiada equivalente, compatível com o porte e a estrutura decisória da organização, definindo em seu ato constitutivo, minimamente, a participação de representantes de áreas relevantes da organização, suas competências, a periodicidade de reuniões, a forma de registro das deliberações e os mecanismos de acompanhamento dos encaminhamentos [S2.2].</w:t>
+            </w:r>
+          </w:p>
+          <w:p>
+            <w:pPr>
+              <w:jc w:val="both"/>
+              <w:rPr>
+                <w:rFonts w:ascii="Arial" w:hAnsi="Arial" w:cs="Arial"/>
+                <w:sz w:val="18"/>
+                <w:szCs w:val="18"/>
+              </w:rPr>
+            </w:pPr>
+            <w:r>
+              <w:rPr>
+                <w:rFonts w:ascii="Arial" w:hAnsi="Arial" w:cs="Arial"/>
+                <w:b/>
+                <w:bCs/>
+                <w:sz w:val="18"/>
+                <w:szCs w:val="18"/>
+                <w:u w:val="single"/>
+              </w:rPr>
+              <w:t>Poder Judiciário Estadual</w:t>
+            </w:r>
+            <w:r>
+              <w:rPr>
+                <w:rFonts w:ascii="Arial" w:hAnsi="Arial" w:cs="Arial"/>
+                <w:sz w:val="18"/>
+                <w:szCs w:val="18"/>
+              </w:rPr>
+              <w:t xml:space="preserve"> — Determinação para que institua formalmente Comitê de TIC ou instância colegiada equivalente, compatível com o porte e a estrutura decisória da organização, definindo em seu ato constitutivo, minimamente, a participação de representantes de áreas relevantes da organização, suas competências, a periodicidade de reuniões, a forma de registro das deliberações e os mecanismos de acompanhamento dos encaminhamentos [S2.2].</w:t>
+            </w:r>
+          </w:p>
+          <w:p>
+            <w:pPr>
+              <w:jc w:val="both"/>
+              <w:rPr>
+                <w:rFonts w:ascii="Arial" w:hAnsi="Arial" w:cs="Arial"/>
+                <w:sz w:val="18"/>
+                <w:szCs w:val="18"/>
+              </w:rPr>
+            </w:pPr>
+            <w:r>
+              <w:rPr>
+                <w:rFonts w:ascii="Arial" w:hAnsi="Arial" w:cs="Arial"/>
+                <w:b/>
+                <w:bCs/>
+                <w:sz w:val="18"/>
+                <w:szCs w:val="18"/>
+                <w:u w:val="single"/>
+              </w:rPr>
+              <w:t>Ministério Público Estadual</w:t>
+            </w:r>
+            <w:r>
+              <w:rPr>
+                <w:rFonts w:ascii="Arial" w:hAnsi="Arial" w:cs="Arial"/>
+                <w:sz w:val="18"/>
+                <w:szCs w:val="18"/>
+              </w:rPr>
+              <w:t xml:space="preserve"> — Determinação para que institua formalmente Comitê de TIC ou instância colegiada equivalente, compatível com o porte e a estrutura decisória da organização, definindo em seu ato constitutivo, minimamente, a participação de representantes de áreas relevantes da organização, suas competências, a periodicidade de reuniões, a forma de registro das deliberações e os mecanismos de acompanhamento dos encaminhamentos [S2.2].</w:t>
+            </w:r>
+          </w:p>
+          <w:p>
+            <w:pPr>
+              <w:jc w:val="both"/>
+              <w:rPr>
+                <w:rFonts w:ascii="Arial" w:hAnsi="Arial" w:cs="Arial"/>
+                <w:sz w:val="18"/>
+                <w:szCs w:val="18"/>
+              </w:rPr>
+            </w:pPr>
+            <w:r>
+              <w:rPr>
+                <w:rFonts w:ascii="Arial" w:hAnsi="Arial" w:cs="Arial"/>
+                <w:b/>
+                <w:bCs/>
+                <w:sz w:val="18"/>
+                <w:szCs w:val="18"/>
+                <w:u w:val="single"/>
+              </w:rPr>
               <w:t>Comunicação com Determinação</w:t>
             </w:r>
             <w:r>
@@ -1686,6 +2481,93 @@
                 <w:szCs w:val="18"/>
               </w:rPr>
               <w:t xml:space="preserve"> para que assegure o funcionamento efetivo do Comitê de TIC ou instância colegiada equivalente, mediante o exercício das competências previstas em seu ato constitutivo, com registro das deliberações e acompanhamento dos respectivos encaminhamentos [S2.3].</w:t>
+            </w:r>
+          </w:p>
+          <w:p>
+            <w:pPr>
+              <w:jc w:val="both"/>
+              <w:rPr>
+                <w:rFonts w:ascii="Arial" w:hAnsi="Arial" w:cs="Arial"/>
+                <w:sz w:val="18"/>
+                <w:szCs w:val="18"/>
+              </w:rPr>
+            </w:pPr>
+            <w:r>
+              <w:rPr>
+                <w:rFonts w:ascii="Arial" w:hAnsi="Arial" w:cs="Arial"/>
+                <w:b/>
+                <w:bCs/>
+                <w:sz w:val="18"/>
+                <w:szCs w:val="18"/>
+                <w:u w:val="single"/>
+              </w:rPr>
+              <w:t>Poder Executivo Estadual</w:t>
+            </w:r>
+            <w:r>
+              <w:rPr>
+                <w:rFonts w:ascii="Arial" w:hAnsi="Arial" w:cs="Arial"/>
+                <w:sz w:val="18"/>
+                <w:szCs w:val="18"/>
+              </w:rPr>
+              <w:t xml:space="preserve"> — Determinação para que assegure o funcionamento efetivo do Comitê de TIC ou instância colegiada equivalente, mediante o exercício das competências previstas em seu ato constitutivo, com registro das deliberações e acompanhamento dos respectivos encaminhamentos [S2.3].</w:t>
+            </w:r>
+          </w:p>
+          <w:p>
+            <w:pPr>
+              <w:jc w:val="both"/>
+              <w:rPr>
+                <w:rFonts w:ascii="Arial" w:hAnsi="Arial" w:cs="Arial"/>
+                <w:sz w:val="18"/>
+                <w:szCs w:val="18"/>
+              </w:rPr>
+            </w:pPr>
+            <w:r>
+              <w:rPr>
+                <w:rFonts w:ascii="Arial" w:hAnsi="Arial" w:cs="Arial"/>
+                <w:b/>
+                <w:bCs/>
+                <w:sz w:val="18"/>
+                <w:szCs w:val="18"/>
+                <w:u w:val="single"/>
+              </w:rPr>
+              <w:t>Poder Judiciário Estadual</w:t>
+            </w:r>
+            <w:r>
+              <w:rPr>
+                <w:rFonts w:ascii="Arial" w:hAnsi="Arial" w:cs="Arial"/>
+                <w:sz w:val="18"/>
+                <w:szCs w:val="18"/>
+              </w:rPr>
+              <w:t xml:space="preserve"> — Determinação para que assegure o funcionamento efetivo do Comitê de TIC ou instância colegiada equivalente, mediante o exercício das competências previstas em seu ato constitutivo, com registro das deliberações e acompanhamento dos respectivos encaminhamentos [S2.3].</w:t>
+            </w:r>
+          </w:p>
+          <w:p>
+            <w:pPr>
+              <w:jc w:val="both"/>
+              <w:rPr>
+                <w:rFonts w:ascii="Arial" w:hAnsi="Arial" w:cs="Arial"/>
+                <w:sz w:val="18"/>
+                <w:szCs w:val="18"/>
+              </w:rPr>
+            </w:pPr>
+            <w:r>
+              <w:rPr>
+                <w:rFonts w:ascii="Arial" w:hAnsi="Arial" w:cs="Arial"/>
+                <w:b/>
+                <w:bCs/>
+                <w:sz w:val="18"/>
+                <w:szCs w:val="18"/>
+                <w:u w:val="single"/>
+              </w:rPr>
+              <w:t>Ministério Público Estadual</w:t>
+            </w:r>
+            <w:r>
+              <w:rPr>
+                <w:rFonts w:ascii="Arial" w:hAnsi="Arial" w:cs="Arial"/>
+                <w:sz w:val="18"/>
+                <w:szCs w:val="18"/>
+              </w:rPr>
+              <w:t xml:space="preserve"> — Determinação para que assegure o funcionamento efetivo do Comitê de TIC ou instância colegiada equivalente, mediante o exercício das competências previstas em seu ato constitutivo, com registro das deliberações e acompanhamento dos respectivos encaminhamentos [S2.3].</w:t>
             </w:r>
           </w:p>
         </w:tc>
@@ -2126,6 +3008,186 @@
               <w:t xml:space="preserve"> elaborar e manter orçamento de TIC alinhado ao portfólio, ao planejamento e às prioridades aprovadas.</w:t>
             </w:r>
           </w:p>
+          <w:p>
+            <w:pPr>
+              <w:jc w:val="both"/>
+              <w:rPr>
+                <w:rFonts w:ascii="Arial" w:eastAsia="Arial" w:hAnsi="Arial" w:cs="Arial"/>
+                <w:b/>
+                <w:bCs/>
+                <w:sz w:val="18"/>
+                <w:szCs w:val="18"/>
+              </w:rPr>
+            </w:pPr>
+          </w:p>
+          <w:p>
+            <w:pPr>
+              <w:jc w:val="both"/>
+              <w:rPr>
+                <w:rFonts w:ascii="Arial" w:hAnsi="Arial" w:cs="Arial"/>
+                <w:sz w:val="18"/>
+                <w:szCs w:val="18"/>
+                <w:vertAlign w:val="superscript"/>
+              </w:rPr>
+            </w:pPr>
+            <w:r>
+              <w:rPr>
+                <w:rFonts w:ascii="Arial" w:hAnsi="Arial" w:cs="Arial"/>
+                <w:b/>
+                <w:sz w:val="18"/>
+                <w:szCs w:val="18"/>
+              </w:rPr>
+              <w:t>Poder Executivo Estadual</w:t>
+            </w:r>
+          </w:p>
+          <w:p>
+            <w:pPr>
+              <w:jc w:val="both"/>
+              <w:rPr>
+                <w:rFonts w:ascii="Arial" w:hAnsi="Arial" w:cs="Arial"/>
+                <w:sz w:val="18"/>
+                <w:szCs w:val="18"/>
+                <w:vertAlign w:val="superscript"/>
+              </w:rPr>
+            </w:pPr>
+            <w:r>
+              <w:rPr>
+                <w:rFonts w:ascii="Arial" w:hAnsi="Arial" w:cs="Arial"/>
+                <w:b/>
+                <w:sz w:val="18"/>
+                <w:szCs w:val="18"/>
+              </w:rPr>
+              <w:t>C5:</w:t>
+            </w:r>
+            <w:r>
+              <w:rPr>
+                <w:rFonts w:ascii="Arial" w:hAnsi="Arial" w:cs="Arial"/>
+                <w:sz w:val="18"/>
+                <w:szCs w:val="18"/>
+              </w:rPr>
+              <w:t xml:space="preserve"> Portaria PRODERJ/PRE nº 825/2021, arts. 1º a 5º e Anexo C, arts. 1º a 14, e IN PRODERJ/PRE nº 05/2024, art. 5º — obrigatoriedade de elaboração, alinhamento institucional, aprovação pela autoridade máxima, integração com orçamento/PCA e revisão periódica do PEDTIC no Poder Executivo Estadual.</w:t>
+            </w:r>
+          </w:p>
+          <w:p>
+            <w:pPr>
+              <w:jc w:val="both"/>
+              <w:rPr>
+                <w:rFonts w:ascii="Arial" w:eastAsia="Arial" w:hAnsi="Arial" w:cs="Arial"/>
+                <w:b/>
+                <w:bCs/>
+                <w:sz w:val="18"/>
+                <w:szCs w:val="18"/>
+              </w:rPr>
+            </w:pPr>
+          </w:p>
+          <w:p>
+            <w:pPr>
+              <w:jc w:val="both"/>
+              <w:rPr>
+                <w:rFonts w:ascii="Arial" w:hAnsi="Arial" w:cs="Arial"/>
+                <w:sz w:val="18"/>
+                <w:szCs w:val="18"/>
+                <w:vertAlign w:val="superscript"/>
+              </w:rPr>
+            </w:pPr>
+            <w:r>
+              <w:rPr>
+                <w:rFonts w:ascii="Arial" w:hAnsi="Arial" w:cs="Arial"/>
+                <w:b/>
+                <w:sz w:val="18"/>
+                <w:szCs w:val="18"/>
+              </w:rPr>
+              <w:t>Poder Judiciário Estadual</w:t>
+            </w:r>
+          </w:p>
+          <w:p>
+            <w:pPr>
+              <w:jc w:val="both"/>
+              <w:rPr>
+                <w:rFonts w:ascii="Arial" w:hAnsi="Arial" w:cs="Arial"/>
+                <w:sz w:val="18"/>
+                <w:szCs w:val="18"/>
+                <w:vertAlign w:val="superscript"/>
+              </w:rPr>
+            </w:pPr>
+            <w:r>
+              <w:rPr>
+                <w:rFonts w:ascii="Arial" w:hAnsi="Arial" w:cs="Arial"/>
+                <w:b/>
+                <w:sz w:val="18"/>
+                <w:szCs w:val="18"/>
+              </w:rPr>
+              <w:t>C6:</w:t>
+            </w:r>
+            <w:r>
+              <w:rPr>
+                <w:rFonts w:ascii="Arial" w:hAnsi="Arial" w:cs="Arial"/>
+                <w:sz w:val="18"/>
+                <w:szCs w:val="18"/>
+              </w:rPr>
+              <w:t xml:space="preserve"> Resolução CNJ nº 370/2021, arts. 6º a 8º, 42, 46 e 48 e Atos Normativos TJ nº 32/2023 e nº 27/2022 — rito de elaboração, alinhamento, aprovação pela Presidência, integração orçamentária e acompanhamento do PDTIC no Poder Judiciário Estadual.</w:t>
+            </w:r>
+          </w:p>
+          <w:p>
+            <w:pPr>
+              <w:jc w:val="both"/>
+              <w:rPr>
+                <w:rFonts w:ascii="Arial" w:eastAsia="Arial" w:hAnsi="Arial" w:cs="Arial"/>
+                <w:b/>
+                <w:bCs/>
+                <w:sz w:val="18"/>
+                <w:szCs w:val="18"/>
+              </w:rPr>
+            </w:pPr>
+          </w:p>
+          <w:p>
+            <w:pPr>
+              <w:jc w:val="both"/>
+              <w:rPr>
+                <w:rFonts w:ascii="Arial" w:hAnsi="Arial" w:cs="Arial"/>
+                <w:sz w:val="18"/>
+                <w:szCs w:val="18"/>
+                <w:vertAlign w:val="superscript"/>
+              </w:rPr>
+            </w:pPr>
+            <w:r>
+              <w:rPr>
+                <w:rFonts w:ascii="Arial" w:hAnsi="Arial" w:cs="Arial"/>
+                <w:b/>
+                <w:sz w:val="18"/>
+                <w:szCs w:val="18"/>
+              </w:rPr>
+              <w:t>Ministério Público Estadual</w:t>
+            </w:r>
+          </w:p>
+          <w:p>
+            <w:pPr>
+              <w:jc w:val="both"/>
+              <w:rPr>
+                <w:rFonts w:ascii="Arial" w:hAnsi="Arial" w:cs="Arial"/>
+                <w:sz w:val="18"/>
+                <w:szCs w:val="18"/>
+                <w:vertAlign w:val="superscript"/>
+              </w:rPr>
+            </w:pPr>
+            <w:r>
+              <w:rPr>
+                <w:rFonts w:ascii="Arial" w:hAnsi="Arial" w:cs="Arial"/>
+                <w:b/>
+                <w:sz w:val="18"/>
+                <w:szCs w:val="18"/>
+              </w:rPr>
+              <w:t>C7:</w:t>
+            </w:r>
+            <w:r>
+              <w:rPr>
+                <w:rFonts w:ascii="Arial" w:hAnsi="Arial" w:cs="Arial"/>
+                <w:sz w:val="18"/>
+                <w:szCs w:val="18"/>
+              </w:rPr>
+              <w:t xml:space="preserve"> Resolução CNMP nº 171/2017, arts. 9º, 11, 12, 14 e 16, Resolução CNMP nº 283/2024, arts. 4º a 6º e Resoluções GPGJ nº 2.785/2026 e nº 2.540/2023 — rito de elaboração, alinhamento institucional, aprovação pelo PGJ, integração orçamentária/PAC e acompanhamento do PETI/PDTI no Ministério Público Estadual.</w:t>
+            </w:r>
+          </w:p>
         </w:tc>
         <w:tc>
           <w:tcPr>
@@ -2584,6 +3646,93 @@
                 <w:szCs w:val="18"/>
                 <w:u w:val="single"/>
               </w:rPr>
+              <w:t>Poder Executivo Estadual</w:t>
+            </w:r>
+            <w:r>
+              <w:rPr>
+                <w:rFonts w:ascii="Arial" w:hAnsi="Arial" w:cs="Arial"/>
+                <w:sz w:val="18"/>
+                <w:szCs w:val="18"/>
+              </w:rPr>
+              <w:t xml:space="preserve"> — Determinação para que institua processo formal de planejamento de TIC, compatível com o porte e a complexidade da organização, que assegure a elaboração e manutenção de plano de TIC, atentando-se, minimamente, em definir etapas, responsabilidades e participação das áreas demandantes [S3.1].</w:t>
+            </w:r>
+          </w:p>
+          <w:p>
+            <w:pPr>
+              <w:jc w:val="both"/>
+              <w:rPr>
+                <w:rFonts w:ascii="Arial" w:hAnsi="Arial" w:cs="Arial"/>
+                <w:sz w:val="18"/>
+                <w:szCs w:val="18"/>
+              </w:rPr>
+            </w:pPr>
+            <w:r>
+              <w:rPr>
+                <w:rFonts w:ascii="Arial" w:hAnsi="Arial" w:cs="Arial"/>
+                <w:b/>
+                <w:bCs/>
+                <w:sz w:val="18"/>
+                <w:szCs w:val="18"/>
+                <w:u w:val="single"/>
+              </w:rPr>
+              <w:t>Poder Judiciário Estadual</w:t>
+            </w:r>
+            <w:r>
+              <w:rPr>
+                <w:rFonts w:ascii="Arial" w:hAnsi="Arial" w:cs="Arial"/>
+                <w:sz w:val="18"/>
+                <w:szCs w:val="18"/>
+              </w:rPr>
+              <w:t xml:space="preserve"> — Determinação para que institua processo formal de planejamento de TIC, compatível com o porte e a complexidade da organização, que assegure a elaboração e manutenção de plano de TIC, atentando-se, minimamente, em definir etapas, responsabilidades e participação das áreas demandantes [S3.1].</w:t>
+            </w:r>
+          </w:p>
+          <w:p>
+            <w:pPr>
+              <w:jc w:val="both"/>
+              <w:rPr>
+                <w:rFonts w:ascii="Arial" w:hAnsi="Arial" w:cs="Arial"/>
+                <w:sz w:val="18"/>
+                <w:szCs w:val="18"/>
+              </w:rPr>
+            </w:pPr>
+            <w:r>
+              <w:rPr>
+                <w:rFonts w:ascii="Arial" w:hAnsi="Arial" w:cs="Arial"/>
+                <w:b/>
+                <w:bCs/>
+                <w:sz w:val="18"/>
+                <w:szCs w:val="18"/>
+                <w:u w:val="single"/>
+              </w:rPr>
+              <w:t>Ministério Público Estadual</w:t>
+            </w:r>
+            <w:r>
+              <w:rPr>
+                <w:rFonts w:ascii="Arial" w:hAnsi="Arial" w:cs="Arial"/>
+                <w:sz w:val="18"/>
+                <w:szCs w:val="18"/>
+              </w:rPr>
+              <w:t xml:space="preserve"> — Determinação para que institua processo formal de planejamento de TIC, compatível com o porte e a complexidade da organização, que assegure a elaboração e manutenção de plano de TIC, atentando-se, minimamente, em definir etapas, responsabilidades e participação das áreas demandantes [S3.1].</w:t>
+            </w:r>
+          </w:p>
+          <w:p>
+            <w:pPr>
+              <w:jc w:val="both"/>
+              <w:rPr>
+                <w:rFonts w:ascii="Arial" w:hAnsi="Arial" w:cs="Arial"/>
+                <w:sz w:val="18"/>
+                <w:szCs w:val="18"/>
+              </w:rPr>
+            </w:pPr>
+            <w:r>
+              <w:rPr>
+                <w:rFonts w:ascii="Arial" w:hAnsi="Arial" w:cs="Arial"/>
+                <w:b/>
+                <w:bCs/>
+                <w:sz w:val="18"/>
+                <w:szCs w:val="18"/>
+                <w:u w:val="single"/>
+              </w:rPr>
               <w:t>Comunicação com Determinação</w:t>
             </w:r>
             <w:r>
@@ -2626,6 +3775,93 @@
                 <w:szCs w:val="18"/>
                 <w:u w:val="single"/>
               </w:rPr>
+              <w:t>Poder Executivo Estadual</w:t>
+            </w:r>
+            <w:r>
+              <w:rPr>
+                <w:rFonts w:ascii="Arial" w:hAnsi="Arial" w:cs="Arial"/>
+                <w:sz w:val="18"/>
+                <w:szCs w:val="18"/>
+              </w:rPr>
+              <w:t xml:space="preserve"> — Determinação para que submeta o plano de TIC à aprovação formal do dirigente máximo ou de instância competente da alta administração, mantendo registro do respectivo ato de aprovação [S3.2].</w:t>
+            </w:r>
+          </w:p>
+          <w:p>
+            <w:pPr>
+              <w:jc w:val="both"/>
+              <w:rPr>
+                <w:rFonts w:ascii="Arial" w:hAnsi="Arial" w:cs="Arial"/>
+                <w:sz w:val="18"/>
+                <w:szCs w:val="18"/>
+              </w:rPr>
+            </w:pPr>
+            <w:r>
+              <w:rPr>
+                <w:rFonts w:ascii="Arial" w:hAnsi="Arial" w:cs="Arial"/>
+                <w:b/>
+                <w:bCs/>
+                <w:sz w:val="18"/>
+                <w:szCs w:val="18"/>
+                <w:u w:val="single"/>
+              </w:rPr>
+              <w:t>Poder Judiciário Estadual</w:t>
+            </w:r>
+            <w:r>
+              <w:rPr>
+                <w:rFonts w:ascii="Arial" w:hAnsi="Arial" w:cs="Arial"/>
+                <w:sz w:val="18"/>
+                <w:szCs w:val="18"/>
+              </w:rPr>
+              <w:t xml:space="preserve"> — Determinação para que submeta o plano de TIC à aprovação formal do dirigente máximo ou de instância competente da alta administração, mantendo registro do respectivo ato de aprovação [S3.2].</w:t>
+            </w:r>
+          </w:p>
+          <w:p>
+            <w:pPr>
+              <w:jc w:val="both"/>
+              <w:rPr>
+                <w:rFonts w:ascii="Arial" w:hAnsi="Arial" w:cs="Arial"/>
+                <w:sz w:val="18"/>
+                <w:szCs w:val="18"/>
+              </w:rPr>
+            </w:pPr>
+            <w:r>
+              <w:rPr>
+                <w:rFonts w:ascii="Arial" w:hAnsi="Arial" w:cs="Arial"/>
+                <w:b/>
+                <w:bCs/>
+                <w:sz w:val="18"/>
+                <w:szCs w:val="18"/>
+                <w:u w:val="single"/>
+              </w:rPr>
+              <w:t>Ministério Público Estadual</w:t>
+            </w:r>
+            <w:r>
+              <w:rPr>
+                <w:rFonts w:ascii="Arial" w:hAnsi="Arial" w:cs="Arial"/>
+                <w:sz w:val="18"/>
+                <w:szCs w:val="18"/>
+              </w:rPr>
+              <w:t xml:space="preserve"> — Determinação para que submeta o plano de TIC à aprovação formal do dirigente máximo ou de instância competente da alta administração, mantendo registro do respectivo ato de aprovação [S3.2].</w:t>
+            </w:r>
+          </w:p>
+          <w:p>
+            <w:pPr>
+              <w:jc w:val="both"/>
+              <w:rPr>
+                <w:rFonts w:ascii="Arial" w:hAnsi="Arial" w:cs="Arial"/>
+                <w:sz w:val="18"/>
+                <w:szCs w:val="18"/>
+              </w:rPr>
+            </w:pPr>
+            <w:r>
+              <w:rPr>
+                <w:rFonts w:ascii="Arial" w:hAnsi="Arial" w:cs="Arial"/>
+                <w:b/>
+                <w:bCs/>
+                <w:sz w:val="18"/>
+                <w:szCs w:val="18"/>
+                <w:u w:val="single"/>
+              </w:rPr>
               <w:t>Comunicação com Determinação</w:t>
             </w:r>
             <w:r>
@@ -2668,6 +3904,93 @@
                 <w:szCs w:val="18"/>
                 <w:u w:val="single"/>
               </w:rPr>
+              <w:t>Poder Executivo Estadual</w:t>
+            </w:r>
+            <w:r>
+              <w:rPr>
+                <w:rFonts w:ascii="Arial" w:hAnsi="Arial" w:cs="Arial"/>
+                <w:sz w:val="18"/>
+                <w:szCs w:val="18"/>
+              </w:rPr>
+              <w:t xml:space="preserve"> — Determinação para que revise o plano de TIC para explicitar seu alinhamento ao planejamento institucional, às diretrizes superiores e às necessidades das áreas finalísticas e administrativas, relacionando objetivos, iniciativas, indicadores e metas de TIC aos resultados institucionais pretendidos [S3.4].</w:t>
+            </w:r>
+          </w:p>
+          <w:p>
+            <w:pPr>
+              <w:jc w:val="both"/>
+              <w:rPr>
+                <w:rFonts w:ascii="Arial" w:hAnsi="Arial" w:cs="Arial"/>
+                <w:sz w:val="18"/>
+                <w:szCs w:val="18"/>
+              </w:rPr>
+            </w:pPr>
+            <w:r>
+              <w:rPr>
+                <w:rFonts w:ascii="Arial" w:hAnsi="Arial" w:cs="Arial"/>
+                <w:b/>
+                <w:bCs/>
+                <w:sz w:val="18"/>
+                <w:szCs w:val="18"/>
+                <w:u w:val="single"/>
+              </w:rPr>
+              <w:t>Poder Judiciário Estadual</w:t>
+            </w:r>
+            <w:r>
+              <w:rPr>
+                <w:rFonts w:ascii="Arial" w:hAnsi="Arial" w:cs="Arial"/>
+                <w:sz w:val="18"/>
+                <w:szCs w:val="18"/>
+              </w:rPr>
+              <w:t xml:space="preserve"> — Determinação para que revise o plano de TIC para explicitar seu alinhamento ao planejamento institucional, às diretrizes superiores e às necessidades das áreas finalísticas e administrativas, relacionando objetivos, iniciativas, indicadores e metas de TIC aos resultados institucionais pretendidos [S3.4].</w:t>
+            </w:r>
+          </w:p>
+          <w:p>
+            <w:pPr>
+              <w:jc w:val="both"/>
+              <w:rPr>
+                <w:rFonts w:ascii="Arial" w:hAnsi="Arial" w:cs="Arial"/>
+                <w:sz w:val="18"/>
+                <w:szCs w:val="18"/>
+              </w:rPr>
+            </w:pPr>
+            <w:r>
+              <w:rPr>
+                <w:rFonts w:ascii="Arial" w:hAnsi="Arial" w:cs="Arial"/>
+                <w:b/>
+                <w:bCs/>
+                <w:sz w:val="18"/>
+                <w:szCs w:val="18"/>
+                <w:u w:val="single"/>
+              </w:rPr>
+              <w:t>Ministério Público Estadual</w:t>
+            </w:r>
+            <w:r>
+              <w:rPr>
+                <w:rFonts w:ascii="Arial" w:hAnsi="Arial" w:cs="Arial"/>
+                <w:sz w:val="18"/>
+                <w:szCs w:val="18"/>
+              </w:rPr>
+              <w:t xml:space="preserve"> — Determinação para que revise o plano de TIC para explicitar seu alinhamento ao planejamento institucional, às diretrizes superiores e às necessidades das áreas finalísticas e administrativas, relacionando objetivos, iniciativas, indicadores e metas de TIC aos resultados institucionais pretendidos [S3.4].</w:t>
+            </w:r>
+          </w:p>
+          <w:p>
+            <w:pPr>
+              <w:jc w:val="both"/>
+              <w:rPr>
+                <w:rFonts w:ascii="Arial" w:hAnsi="Arial" w:cs="Arial"/>
+                <w:sz w:val="18"/>
+                <w:szCs w:val="18"/>
+              </w:rPr>
+            </w:pPr>
+            <w:r>
+              <w:rPr>
+                <w:rFonts w:ascii="Arial" w:hAnsi="Arial" w:cs="Arial"/>
+                <w:b/>
+                <w:bCs/>
+                <w:sz w:val="18"/>
+                <w:szCs w:val="18"/>
+                <w:u w:val="single"/>
+              </w:rPr>
               <w:t>Comunicação com Determinação</w:t>
             </w:r>
             <w:r>
@@ -2710,6 +4033,93 @@
                 <w:szCs w:val="18"/>
                 <w:u w:val="single"/>
               </w:rPr>
+              <w:t>Poder Executivo Estadual</w:t>
+            </w:r>
+            <w:r>
+              <w:rPr>
+                <w:rFonts w:ascii="Arial" w:hAnsi="Arial" w:cs="Arial"/>
+                <w:sz w:val="18"/>
+                <w:szCs w:val="18"/>
+              </w:rPr>
+              <w:t xml:space="preserve"> — Determinação para que integre o plano de TIC à elaboração da proposta orçamentária e do plano de contratações, de maneira proporcional ao porte, à estrutura e à capacidade de planejamento da organização [S3.5].</w:t>
+            </w:r>
+          </w:p>
+          <w:p>
+            <w:pPr>
+              <w:jc w:val="both"/>
+              <w:rPr>
+                <w:rFonts w:ascii="Arial" w:hAnsi="Arial" w:cs="Arial"/>
+                <w:sz w:val="18"/>
+                <w:szCs w:val="18"/>
+              </w:rPr>
+            </w:pPr>
+            <w:r>
+              <w:rPr>
+                <w:rFonts w:ascii="Arial" w:hAnsi="Arial" w:cs="Arial"/>
+                <w:b/>
+                <w:bCs/>
+                <w:sz w:val="18"/>
+                <w:szCs w:val="18"/>
+                <w:u w:val="single"/>
+              </w:rPr>
+              <w:t>Poder Judiciário Estadual</w:t>
+            </w:r>
+            <w:r>
+              <w:rPr>
+                <w:rFonts w:ascii="Arial" w:hAnsi="Arial" w:cs="Arial"/>
+                <w:sz w:val="18"/>
+                <w:szCs w:val="18"/>
+              </w:rPr>
+              <w:t xml:space="preserve"> — Determinação para que integre o plano de TIC à elaboração da proposta orçamentária e do plano de contratações, de maneira proporcional ao porte, à estrutura e à capacidade de planejamento da organização [S3.5].</w:t>
+            </w:r>
+          </w:p>
+          <w:p>
+            <w:pPr>
+              <w:jc w:val="both"/>
+              <w:rPr>
+                <w:rFonts w:ascii="Arial" w:hAnsi="Arial" w:cs="Arial"/>
+                <w:sz w:val="18"/>
+                <w:szCs w:val="18"/>
+              </w:rPr>
+            </w:pPr>
+            <w:r>
+              <w:rPr>
+                <w:rFonts w:ascii="Arial" w:hAnsi="Arial" w:cs="Arial"/>
+                <w:b/>
+                <w:bCs/>
+                <w:sz w:val="18"/>
+                <w:szCs w:val="18"/>
+                <w:u w:val="single"/>
+              </w:rPr>
+              <w:t>Ministério Público Estadual</w:t>
+            </w:r>
+            <w:r>
+              <w:rPr>
+                <w:rFonts w:ascii="Arial" w:hAnsi="Arial" w:cs="Arial"/>
+                <w:sz w:val="18"/>
+                <w:szCs w:val="18"/>
+              </w:rPr>
+              <w:t xml:space="preserve"> — Determinação para que integre o plano de TIC à elaboração da proposta orçamentária e do plano de contratações, de maneira proporcional ao porte, à estrutura e à capacidade de planejamento da organização [S3.5].</w:t>
+            </w:r>
+          </w:p>
+          <w:p>
+            <w:pPr>
+              <w:jc w:val="both"/>
+              <w:rPr>
+                <w:rFonts w:ascii="Arial" w:hAnsi="Arial" w:cs="Arial"/>
+                <w:sz w:val="18"/>
+                <w:szCs w:val="18"/>
+              </w:rPr>
+            </w:pPr>
+            <w:r>
+              <w:rPr>
+                <w:rFonts w:ascii="Arial" w:hAnsi="Arial" w:cs="Arial"/>
+                <w:b/>
+                <w:bCs/>
+                <w:sz w:val="18"/>
+                <w:szCs w:val="18"/>
+                <w:u w:val="single"/>
+              </w:rPr>
               <w:t>Comunicação com Determinação</w:t>
             </w:r>
             <w:r>
@@ -2719,6 +4129,93 @@
                 <w:szCs w:val="18"/>
               </w:rPr>
               <w:t xml:space="preserve"> para que estabeleça e execute rotina periódica de acompanhamento da execução do plano de TIC, promovendo sua revisão periódica e os ajustes ou atualizações necessários, com registro das principais decisões e reprogramações [S3.6].</w:t>
+            </w:r>
+          </w:p>
+          <w:p>
+            <w:pPr>
+              <w:jc w:val="both"/>
+              <w:rPr>
+                <w:rFonts w:ascii="Arial" w:hAnsi="Arial" w:cs="Arial"/>
+                <w:sz w:val="18"/>
+                <w:szCs w:val="18"/>
+              </w:rPr>
+            </w:pPr>
+            <w:r>
+              <w:rPr>
+                <w:rFonts w:ascii="Arial" w:hAnsi="Arial" w:cs="Arial"/>
+                <w:b/>
+                <w:bCs/>
+                <w:sz w:val="18"/>
+                <w:szCs w:val="18"/>
+                <w:u w:val="single"/>
+              </w:rPr>
+              <w:t>Poder Executivo Estadual</w:t>
+            </w:r>
+            <w:r>
+              <w:rPr>
+                <w:rFonts w:ascii="Arial" w:hAnsi="Arial" w:cs="Arial"/>
+                <w:sz w:val="18"/>
+                <w:szCs w:val="18"/>
+              </w:rPr>
+              <w:t xml:space="preserve"> — Determinação para que estabeleça e execute rotina periódica de acompanhamento da execução do plano de TIC, promovendo sua revisão periódica e os ajustes ou atualizações necessários, com registro das principais decisões e reprogramações [S3.6].</w:t>
+            </w:r>
+          </w:p>
+          <w:p>
+            <w:pPr>
+              <w:jc w:val="both"/>
+              <w:rPr>
+                <w:rFonts w:ascii="Arial" w:hAnsi="Arial" w:cs="Arial"/>
+                <w:sz w:val="18"/>
+                <w:szCs w:val="18"/>
+              </w:rPr>
+            </w:pPr>
+            <w:r>
+              <w:rPr>
+                <w:rFonts w:ascii="Arial" w:hAnsi="Arial" w:cs="Arial"/>
+                <w:b/>
+                <w:bCs/>
+                <w:sz w:val="18"/>
+                <w:szCs w:val="18"/>
+                <w:u w:val="single"/>
+              </w:rPr>
+              <w:t>Poder Judiciário Estadual</w:t>
+            </w:r>
+            <w:r>
+              <w:rPr>
+                <w:rFonts w:ascii="Arial" w:hAnsi="Arial" w:cs="Arial"/>
+                <w:sz w:val="18"/>
+                <w:szCs w:val="18"/>
+              </w:rPr>
+              <w:t xml:space="preserve"> — Determinação para que estabeleça e execute rotina periódica de acompanhamento da execução do plano de TIC, promovendo sua revisão periódica e os ajustes ou atualizações necessários, com registro das principais decisões e reprogramações [S3.6].</w:t>
+            </w:r>
+          </w:p>
+          <w:p>
+            <w:pPr>
+              <w:jc w:val="both"/>
+              <w:rPr>
+                <w:rFonts w:ascii="Arial" w:hAnsi="Arial" w:cs="Arial"/>
+                <w:sz w:val="18"/>
+                <w:szCs w:val="18"/>
+              </w:rPr>
+            </w:pPr>
+            <w:r>
+              <w:rPr>
+                <w:rFonts w:ascii="Arial" w:hAnsi="Arial" w:cs="Arial"/>
+                <w:b/>
+                <w:bCs/>
+                <w:sz w:val="18"/>
+                <w:szCs w:val="18"/>
+                <w:u w:val="single"/>
+              </w:rPr>
+              <w:t>Ministério Público Estadual</w:t>
+            </w:r>
+            <w:r>
+              <w:rPr>
+                <w:rFonts w:ascii="Arial" w:hAnsi="Arial" w:cs="Arial"/>
+                <w:sz w:val="18"/>
+                <w:szCs w:val="18"/>
+              </w:rPr>
+              <w:t xml:space="preserve"> — Determinação para que estabeleça e execute rotina periódica de acompanhamento da execução do plano de TIC, promovendo sua revisão periódica e os ajustes ou atualizações necessários, com registro das principais decisões e reprogramações [S3.6].</w:t>
             </w:r>
           </w:p>
         </w:tc>
@@ -3279,6 +4776,186 @@
               <w:t/>
             </w:r>
           </w:p>
+          <w:p>
+            <w:pPr>
+              <w:jc w:val="both"/>
+              <w:rPr>
+                <w:rFonts w:ascii="Arial" w:eastAsia="Arial" w:hAnsi="Arial" w:cs="Arial"/>
+                <w:b/>
+                <w:bCs/>
+                <w:sz w:val="18"/>
+                <w:szCs w:val="18"/>
+              </w:rPr>
+            </w:pPr>
+          </w:p>
+          <w:p>
+            <w:pPr>
+              <w:jc w:val="both"/>
+              <w:rPr>
+                <w:rFonts w:ascii="Arial" w:hAnsi="Arial" w:cs="Arial"/>
+                <w:sz w:val="18"/>
+                <w:szCs w:val="18"/>
+                <w:vertAlign w:val="superscript"/>
+              </w:rPr>
+            </w:pPr>
+            <w:r>
+              <w:rPr>
+                <w:rFonts w:ascii="Arial" w:hAnsi="Arial" w:cs="Arial"/>
+                <w:b/>
+                <w:sz w:val="18"/>
+                <w:szCs w:val="18"/>
+              </w:rPr>
+              <w:t>Poder Executivo Estadual</w:t>
+            </w:r>
+          </w:p>
+          <w:p>
+            <w:pPr>
+              <w:jc w:val="both"/>
+              <w:rPr>
+                <w:rFonts w:ascii="Arial" w:hAnsi="Arial" w:cs="Arial"/>
+                <w:sz w:val="18"/>
+                <w:szCs w:val="18"/>
+                <w:vertAlign w:val="superscript"/>
+              </w:rPr>
+            </w:pPr>
+            <w:r>
+              <w:rPr>
+                <w:rFonts w:ascii="Arial" w:hAnsi="Arial" w:cs="Arial"/>
+                <w:b/>
+                <w:sz w:val="18"/>
+                <w:szCs w:val="18"/>
+              </w:rPr>
+              <w:t>C15:</w:t>
+            </w:r>
+            <w:r>
+              <w:rPr>
+                <w:rFonts w:ascii="Arial" w:hAnsi="Arial" w:cs="Arial"/>
+                <w:sz w:val="18"/>
+                <w:szCs w:val="18"/>
+              </w:rPr>
+              <w:t xml:space="preserve"> Decreto Estadual nº 47.278/2020, arts. 4º e 6º e IN PRODERJ/PRE nº 07/2025, arts. 11, 17 e 18 — capacidade técnica da área de TIC e designação formal obrigatória de Gestor de Segurança da Informação e responsável por incidentes no Poder Executivo Estadual.</w:t>
+            </w:r>
+          </w:p>
+          <w:p>
+            <w:pPr>
+              <w:jc w:val="both"/>
+              <w:rPr>
+                <w:rFonts w:ascii="Arial" w:eastAsia="Arial" w:hAnsi="Arial" w:cs="Arial"/>
+                <w:b/>
+                <w:bCs/>
+                <w:sz w:val="18"/>
+                <w:szCs w:val="18"/>
+              </w:rPr>
+            </w:pPr>
+          </w:p>
+          <w:p>
+            <w:pPr>
+              <w:jc w:val="both"/>
+              <w:rPr>
+                <w:rFonts w:ascii="Arial" w:hAnsi="Arial" w:cs="Arial"/>
+                <w:sz w:val="18"/>
+                <w:szCs w:val="18"/>
+                <w:vertAlign w:val="superscript"/>
+              </w:rPr>
+            </w:pPr>
+            <w:r>
+              <w:rPr>
+                <w:rFonts w:ascii="Arial" w:hAnsi="Arial" w:cs="Arial"/>
+                <w:b/>
+                <w:sz w:val="18"/>
+                <w:szCs w:val="18"/>
+              </w:rPr>
+              <w:t>Poder Judiciário Estadual</w:t>
+            </w:r>
+          </w:p>
+          <w:p>
+            <w:pPr>
+              <w:jc w:val="both"/>
+              <w:rPr>
+                <w:rFonts w:ascii="Arial" w:hAnsi="Arial" w:cs="Arial"/>
+                <w:sz w:val="18"/>
+                <w:szCs w:val="18"/>
+                <w:vertAlign w:val="superscript"/>
+              </w:rPr>
+            </w:pPr>
+            <w:r>
+              <w:rPr>
+                <w:rFonts w:ascii="Arial" w:hAnsi="Arial" w:cs="Arial"/>
+                <w:b/>
+                <w:sz w:val="18"/>
+                <w:szCs w:val="18"/>
+              </w:rPr>
+              <w:t>C16:</w:t>
+            </w:r>
+            <w:r>
+              <w:rPr>
+                <w:rFonts w:ascii="Arial" w:hAnsi="Arial" w:cs="Arial"/>
+                <w:sz w:val="18"/>
+                <w:szCs w:val="18"/>
+              </w:rPr>
+              <w:t xml:space="preserve"> Resolução CNJ nº 370/2021, art. 24, caput e §§ 1º a 3º, Resolução CNJ nº 468/2022, art. 8º, § 1º e Resolução CNJ nº 396/2021, art. 7º — exigência de quadro permanente e exclusivo de servidores de TIC, dimensionamento documentado por guia técnico, vedação de terceirização de gestão e papéis formais de cibersegurança no Poder Judiciário Estadual.</w:t>
+            </w:r>
+          </w:p>
+          <w:p>
+            <w:pPr>
+              <w:jc w:val="both"/>
+              <w:rPr>
+                <w:rFonts w:ascii="Arial" w:eastAsia="Arial" w:hAnsi="Arial" w:cs="Arial"/>
+                <w:b/>
+                <w:bCs/>
+                <w:sz w:val="18"/>
+                <w:szCs w:val="18"/>
+              </w:rPr>
+            </w:pPr>
+          </w:p>
+          <w:p>
+            <w:pPr>
+              <w:jc w:val="both"/>
+              <w:rPr>
+                <w:rFonts w:ascii="Arial" w:hAnsi="Arial" w:cs="Arial"/>
+                <w:sz w:val="18"/>
+                <w:szCs w:val="18"/>
+                <w:vertAlign w:val="superscript"/>
+              </w:rPr>
+            </w:pPr>
+            <w:r>
+              <w:rPr>
+                <w:rFonts w:ascii="Arial" w:hAnsi="Arial" w:cs="Arial"/>
+                <w:b/>
+                <w:sz w:val="18"/>
+                <w:szCs w:val="18"/>
+              </w:rPr>
+              <w:t>Ministério Público Estadual</w:t>
+            </w:r>
+          </w:p>
+          <w:p>
+            <w:pPr>
+              <w:jc w:val="both"/>
+              <w:rPr>
+                <w:rFonts w:ascii="Arial" w:hAnsi="Arial" w:cs="Arial"/>
+                <w:sz w:val="18"/>
+                <w:szCs w:val="18"/>
+                <w:vertAlign w:val="superscript"/>
+              </w:rPr>
+            </w:pPr>
+            <w:r>
+              <w:rPr>
+                <w:rFonts w:ascii="Arial" w:hAnsi="Arial" w:cs="Arial"/>
+                <w:b/>
+                <w:sz w:val="18"/>
+                <w:szCs w:val="18"/>
+              </w:rPr>
+              <w:t>C17:</w:t>
+            </w:r>
+            <w:r>
+              <w:rPr>
+                <w:rFonts w:ascii="Arial" w:hAnsi="Arial" w:cs="Arial"/>
+                <w:sz w:val="18"/>
+                <w:szCs w:val="18"/>
+              </w:rPr>
+              <w:t xml:space="preserve"> Resolução CNMP nº 171/2017, arts. 16 e 33, Resolução CNMP nº 283/2024, art. 9º, § 2º e art. 33 e Resoluções GPGJ nº 2.675/2025 e nº 2.757/2025 — quadro próprio de TIC, vedação de terceirização de atividades exclusivas e atribuição de funções formais de TIC e segurança no Ministério Público Estadual.</w:t>
+            </w:r>
+          </w:p>
         </w:tc>
         <w:tc>
           <w:tcPr>
@@ -3669,6 +5346,93 @@
                 <w:szCs w:val="18"/>
                 <w:u w:val="single"/>
               </w:rPr>
+              <w:t>Poder Executivo Estadual</w:t>
+            </w:r>
+            <w:r>
+              <w:rPr>
+                <w:rFonts w:ascii="Arial" w:hAnsi="Arial" w:cs="Arial"/>
+                <w:sz w:val="18"/>
+                <w:szCs w:val="18"/>
+              </w:rPr>
+              <w:t xml:space="preserve"> — Recomendação para que avalie a força de trabalho dedicada à TIC e adote medidas proporcionais para assegurar capacidade mínima de planejamento, gestão, proteção, contratação, fiscalização e sustentação dos serviços e ativos de TIC [S4.1].</w:t>
+            </w:r>
+          </w:p>
+          <w:p>
+            <w:pPr>
+              <w:jc w:val="both"/>
+              <w:rPr>
+                <w:rFonts w:ascii="Arial" w:hAnsi="Arial" w:cs="Arial"/>
+                <w:sz w:val="18"/>
+                <w:szCs w:val="18"/>
+              </w:rPr>
+            </w:pPr>
+            <w:r>
+              <w:rPr>
+                <w:rFonts w:ascii="Arial" w:hAnsi="Arial" w:cs="Arial"/>
+                <w:b/>
+                <w:bCs/>
+                <w:sz w:val="18"/>
+                <w:szCs w:val="18"/>
+                <w:u w:val="single"/>
+              </w:rPr>
+              <w:t>Poder Judiciário Estadual</w:t>
+            </w:r>
+            <w:r>
+              <w:rPr>
+                <w:rFonts w:ascii="Arial" w:hAnsi="Arial" w:cs="Arial"/>
+                <w:sz w:val="18"/>
+                <w:szCs w:val="18"/>
+              </w:rPr>
+              <w:t xml:space="preserve"> — Determinação para que avalie a força de trabalho dedicada à TIC e adote medidas proporcionais para assegurar capacidade mínima de planejamento, gestão, proteção, contratação, fiscalização e sustentação dos serviços e ativos de TIC [S4.1].</w:t>
+            </w:r>
+          </w:p>
+          <w:p>
+            <w:pPr>
+              <w:jc w:val="both"/>
+              <w:rPr>
+                <w:rFonts w:ascii="Arial" w:hAnsi="Arial" w:cs="Arial"/>
+                <w:sz w:val="18"/>
+                <w:szCs w:val="18"/>
+              </w:rPr>
+            </w:pPr>
+            <w:r>
+              <w:rPr>
+                <w:rFonts w:ascii="Arial" w:hAnsi="Arial" w:cs="Arial"/>
+                <w:b/>
+                <w:bCs/>
+                <w:sz w:val="18"/>
+                <w:szCs w:val="18"/>
+                <w:u w:val="single"/>
+              </w:rPr>
+              <w:t>Ministério Público Estadual</w:t>
+            </w:r>
+            <w:r>
+              <w:rPr>
+                <w:rFonts w:ascii="Arial" w:hAnsi="Arial" w:cs="Arial"/>
+                <w:sz w:val="18"/>
+                <w:szCs w:val="18"/>
+              </w:rPr>
+              <w:t xml:space="preserve"> — Recomendação para que avalie a força de trabalho dedicada à TIC e adote medidas proporcionais para assegurar capacidade mínima de planejamento, gestão, proteção, contratação, fiscalização e sustentação dos serviços e ativos de TIC [S4.1].</w:t>
+            </w:r>
+          </w:p>
+          <w:p>
+            <w:pPr>
+              <w:jc w:val="both"/>
+              <w:rPr>
+                <w:rFonts w:ascii="Arial" w:hAnsi="Arial" w:cs="Arial"/>
+                <w:sz w:val="18"/>
+                <w:szCs w:val="18"/>
+              </w:rPr>
+            </w:pPr>
+            <w:r>
+              <w:rPr>
+                <w:rFonts w:ascii="Arial" w:hAnsi="Arial" w:cs="Arial"/>
+                <w:b/>
+                <w:bCs/>
+                <w:sz w:val="18"/>
+                <w:szCs w:val="18"/>
+                <w:u w:val="single"/>
+              </w:rPr>
               <w:t>Comunicação com Recomendação</w:t>
             </w:r>
             <w:r>
@@ -3711,6 +5475,93 @@
                 <w:szCs w:val="18"/>
                 <w:u w:val="single"/>
               </w:rPr>
+              <w:t>Poder Executivo Estadual</w:t>
+            </w:r>
+            <w:r>
+              <w:rPr>
+                <w:rFonts w:ascii="Arial" w:hAnsi="Arial" w:cs="Arial"/>
+                <w:sz w:val="18"/>
+                <w:szCs w:val="18"/>
+              </w:rPr>
+              <w:t xml:space="preserve"> — Recomendação para que estime e mantenha atualizado o quantitativo necessário de pessoal de TIC e segurança da informação, considerando o porte e a complexidade da organização, os serviços críticos, os sistemas mantidos, as contratações vigentes e os riscos relevantes [S4.2].</w:t>
+            </w:r>
+          </w:p>
+          <w:p>
+            <w:pPr>
+              <w:jc w:val="both"/>
+              <w:rPr>
+                <w:rFonts w:ascii="Arial" w:hAnsi="Arial" w:cs="Arial"/>
+                <w:sz w:val="18"/>
+                <w:szCs w:val="18"/>
+              </w:rPr>
+            </w:pPr>
+            <w:r>
+              <w:rPr>
+                <w:rFonts w:ascii="Arial" w:hAnsi="Arial" w:cs="Arial"/>
+                <w:b/>
+                <w:bCs/>
+                <w:sz w:val="18"/>
+                <w:szCs w:val="18"/>
+                <w:u w:val="single"/>
+              </w:rPr>
+              <w:t>Poder Judiciário Estadual</w:t>
+            </w:r>
+            <w:r>
+              <w:rPr>
+                <w:rFonts w:ascii="Arial" w:hAnsi="Arial" w:cs="Arial"/>
+                <w:sz w:val="18"/>
+                <w:szCs w:val="18"/>
+              </w:rPr>
+              <w:t xml:space="preserve"> — Determinação para que estime e mantenha atualizado o quantitativo necessário de pessoal de TIC e segurança da informação, considerando o porte e a complexidade da organização, os serviços críticos, os sistemas mantidos, as contratações vigentes e os riscos relevantes [S4.2].</w:t>
+            </w:r>
+          </w:p>
+          <w:p>
+            <w:pPr>
+              <w:jc w:val="both"/>
+              <w:rPr>
+                <w:rFonts w:ascii="Arial" w:hAnsi="Arial" w:cs="Arial"/>
+                <w:sz w:val="18"/>
+                <w:szCs w:val="18"/>
+              </w:rPr>
+            </w:pPr>
+            <w:r>
+              <w:rPr>
+                <w:rFonts w:ascii="Arial" w:hAnsi="Arial" w:cs="Arial"/>
+                <w:b/>
+                <w:bCs/>
+                <w:sz w:val="18"/>
+                <w:szCs w:val="18"/>
+                <w:u w:val="single"/>
+              </w:rPr>
+              <w:t>Ministério Público Estadual</w:t>
+            </w:r>
+            <w:r>
+              <w:rPr>
+                <w:rFonts w:ascii="Arial" w:hAnsi="Arial" w:cs="Arial"/>
+                <w:sz w:val="18"/>
+                <w:szCs w:val="18"/>
+              </w:rPr>
+              <w:t xml:space="preserve"> — Recomendação para que estime e mantenha atualizado o quantitativo necessário de pessoal de TIC e segurança da informação, considerando o porte e a complexidade da organização, os serviços críticos, os sistemas mantidos, as contratações vigentes e os riscos relevantes [S4.2].</w:t>
+            </w:r>
+          </w:p>
+          <w:p>
+            <w:pPr>
+              <w:jc w:val="both"/>
+              <w:rPr>
+                <w:rFonts w:ascii="Arial" w:hAnsi="Arial" w:cs="Arial"/>
+                <w:sz w:val="18"/>
+                <w:szCs w:val="18"/>
+              </w:rPr>
+            </w:pPr>
+            <w:r>
+              <w:rPr>
+                <w:rFonts w:ascii="Arial" w:hAnsi="Arial" w:cs="Arial"/>
+                <w:b/>
+                <w:bCs/>
+                <w:sz w:val="18"/>
+                <w:szCs w:val="18"/>
+                <w:u w:val="single"/>
+              </w:rPr>
               <w:t>Comunicação com Recomendação</w:t>
             </w:r>
             <w:r>
@@ -3753,6 +5604,93 @@
                 <w:szCs w:val="18"/>
                 <w:u w:val="single"/>
               </w:rPr>
+              <w:t>Poder Executivo Estadual</w:t>
+            </w:r>
+            <w:r>
+              <w:rPr>
+                <w:rFonts w:ascii="Arial" w:hAnsi="Arial" w:cs="Arial"/>
+                <w:sz w:val="18"/>
+                <w:szCs w:val="18"/>
+              </w:rPr>
+              <w:t xml:space="preserve"> — Recomendação para que avalie a necessidade de formalizar a atribuição de cargos ou funções à TIC e à segurança da informação e adote solução compatível com as necessidades institucionais e a capacidade administrativa da organização [S4.3].</w:t>
+            </w:r>
+          </w:p>
+          <w:p>
+            <w:pPr>
+              <w:jc w:val="both"/>
+              <w:rPr>
+                <w:rFonts w:ascii="Arial" w:hAnsi="Arial" w:cs="Arial"/>
+                <w:sz w:val="18"/>
+                <w:szCs w:val="18"/>
+              </w:rPr>
+            </w:pPr>
+            <w:r>
+              <w:rPr>
+                <w:rFonts w:ascii="Arial" w:hAnsi="Arial" w:cs="Arial"/>
+                <w:b/>
+                <w:bCs/>
+                <w:sz w:val="18"/>
+                <w:szCs w:val="18"/>
+                <w:u w:val="single"/>
+              </w:rPr>
+              <w:t>Poder Judiciário Estadual</w:t>
+            </w:r>
+            <w:r>
+              <w:rPr>
+                <w:rFonts w:ascii="Arial" w:hAnsi="Arial" w:cs="Arial"/>
+                <w:sz w:val="18"/>
+                <w:szCs w:val="18"/>
+              </w:rPr>
+              <w:t xml:space="preserve"> — Recomendação para que avalie a necessidade de formalizar a atribuição de cargos ou funções à TIC e à segurança da informação e adote solução compatível com as necessidades institucionais e a capacidade administrativa da organização [S4.3].</w:t>
+            </w:r>
+          </w:p>
+          <w:p>
+            <w:pPr>
+              <w:jc w:val="both"/>
+              <w:rPr>
+                <w:rFonts w:ascii="Arial" w:hAnsi="Arial" w:cs="Arial"/>
+                <w:sz w:val="18"/>
+                <w:szCs w:val="18"/>
+              </w:rPr>
+            </w:pPr>
+            <w:r>
+              <w:rPr>
+                <w:rFonts w:ascii="Arial" w:hAnsi="Arial" w:cs="Arial"/>
+                <w:b/>
+                <w:bCs/>
+                <w:sz w:val="18"/>
+                <w:szCs w:val="18"/>
+                <w:u w:val="single"/>
+              </w:rPr>
+              <w:t>Ministério Público Estadual</w:t>
+            </w:r>
+            <w:r>
+              <w:rPr>
+                <w:rFonts w:ascii="Arial" w:hAnsi="Arial" w:cs="Arial"/>
+                <w:sz w:val="18"/>
+                <w:szCs w:val="18"/>
+              </w:rPr>
+              <w:t xml:space="preserve"> — Recomendação para que avalie a necessidade de formalizar a atribuição de cargos ou funções à TIC e à segurança da informação e adote solução compatível com as necessidades institucionais e a capacidade administrativa da organização [S4.3].</w:t>
+            </w:r>
+          </w:p>
+          <w:p>
+            <w:pPr>
+              <w:jc w:val="both"/>
+              <w:rPr>
+                <w:rFonts w:ascii="Arial" w:hAnsi="Arial" w:cs="Arial"/>
+                <w:sz w:val="18"/>
+                <w:szCs w:val="18"/>
+              </w:rPr>
+            </w:pPr>
+            <w:r>
+              <w:rPr>
+                <w:rFonts w:ascii="Arial" w:hAnsi="Arial" w:cs="Arial"/>
+                <w:b/>
+                <w:bCs/>
+                <w:sz w:val="18"/>
+                <w:szCs w:val="18"/>
+                <w:u w:val="single"/>
+              </w:rPr>
               <w:t>Comunicação com Recomendação</w:t>
             </w:r>
             <w:r>
@@ -3762,6 +5700,93 @@
                 <w:szCs w:val="18"/>
               </w:rPr>
               <w:t xml:space="preserve"> para que avalie o modelo de operação de TIC e adote medidas proporcionais para assegurar capacidade interna suficiente para coordenar, supervisionar e fiscalizar as atividades e os contratos de TIC executados predominantemente por terceiros, preservando responsabilização e retenção de conhecimento [S4.6].</w:t>
+            </w:r>
+          </w:p>
+          <w:p>
+            <w:pPr>
+              <w:jc w:val="both"/>
+              <w:rPr>
+                <w:rFonts w:ascii="Arial" w:hAnsi="Arial" w:cs="Arial"/>
+                <w:sz w:val="18"/>
+                <w:szCs w:val="18"/>
+              </w:rPr>
+            </w:pPr>
+            <w:r>
+              <w:rPr>
+                <w:rFonts w:ascii="Arial" w:hAnsi="Arial" w:cs="Arial"/>
+                <w:b/>
+                <w:bCs/>
+                <w:sz w:val="18"/>
+                <w:szCs w:val="18"/>
+                <w:u w:val="single"/>
+              </w:rPr>
+              <w:t>Poder Executivo Estadual</w:t>
+            </w:r>
+            <w:r>
+              <w:rPr>
+                <w:rFonts w:ascii="Arial" w:hAnsi="Arial" w:cs="Arial"/>
+                <w:sz w:val="18"/>
+                <w:szCs w:val="18"/>
+              </w:rPr>
+              <w:t xml:space="preserve"> — Recomendação para que avalie o modelo de operação de TIC e adote medidas proporcionais para assegurar capacidade interna suficiente para coordenar, supervisionar e fiscalizar as atividades e os contratos de TIC executados predominantemente por terceiros, preservando responsabilização e retenção de conhecimento [S4.6].</w:t>
+            </w:r>
+          </w:p>
+          <w:p>
+            <w:pPr>
+              <w:jc w:val="both"/>
+              <w:rPr>
+                <w:rFonts w:ascii="Arial" w:hAnsi="Arial" w:cs="Arial"/>
+                <w:sz w:val="18"/>
+                <w:szCs w:val="18"/>
+              </w:rPr>
+            </w:pPr>
+            <w:r>
+              <w:rPr>
+                <w:rFonts w:ascii="Arial" w:hAnsi="Arial" w:cs="Arial"/>
+                <w:b/>
+                <w:bCs/>
+                <w:sz w:val="18"/>
+                <w:szCs w:val="18"/>
+                <w:u w:val="single"/>
+              </w:rPr>
+              <w:t>Poder Judiciário Estadual</w:t>
+            </w:r>
+            <w:r>
+              <w:rPr>
+                <w:rFonts w:ascii="Arial" w:hAnsi="Arial" w:cs="Arial"/>
+                <w:sz w:val="18"/>
+                <w:szCs w:val="18"/>
+              </w:rPr>
+              <w:t xml:space="preserve"> — Determinação para que avalie o modelo de operação de TIC e adote medidas proporcionais para assegurar capacidade interna suficiente para coordenar, supervisionar e fiscalizar as atividades e os contratos de TIC executados predominantemente por terceiros, preservando responsabilização e retenção de conhecimento [S4.6].</w:t>
+            </w:r>
+          </w:p>
+          <w:p>
+            <w:pPr>
+              <w:jc w:val="both"/>
+              <w:rPr>
+                <w:rFonts w:ascii="Arial" w:hAnsi="Arial" w:cs="Arial"/>
+                <w:sz w:val="18"/>
+                <w:szCs w:val="18"/>
+              </w:rPr>
+            </w:pPr>
+            <w:r>
+              <w:rPr>
+                <w:rFonts w:ascii="Arial" w:hAnsi="Arial" w:cs="Arial"/>
+                <w:b/>
+                <w:bCs/>
+                <w:sz w:val="18"/>
+                <w:szCs w:val="18"/>
+                <w:u w:val="single"/>
+              </w:rPr>
+              <w:t>Ministério Público Estadual</w:t>
+            </w:r>
+            <w:r>
+              <w:rPr>
+                <w:rFonts w:ascii="Arial" w:hAnsi="Arial" w:cs="Arial"/>
+                <w:sz w:val="18"/>
+                <w:szCs w:val="18"/>
+              </w:rPr>
+              <w:t xml:space="preserve"> — Determinação para que avalie o modelo de operação de TIC e adote medidas proporcionais para assegurar capacidade interna suficiente para coordenar, supervisionar e fiscalizar as atividades e os contratos de TIC executados predominantemente por terceiros, preservando responsabilização e retenção de conhecimento [S4.6].</w:t>
             </w:r>
           </w:p>
         </w:tc>
@@ -4522,6 +6547,186 @@
               <w:t>2021, item 8.6.1 – Gerenciamento de incidente: orienta que os incidentes sejam registrados, classificados e priorizados, que as ações adotadas para sua resolução sejam registradas e rastreáveis e que sejam definidas responsabilidades para seu tratamento, incluindo procedimento documentado para incidentes graves.</w:t>
             </w:r>
           </w:p>
+          <w:p>
+            <w:pPr>
+              <w:jc w:val="both"/>
+              <w:rPr>
+                <w:rFonts w:ascii="Arial" w:eastAsia="Arial" w:hAnsi="Arial" w:cs="Arial"/>
+                <w:b/>
+                <w:bCs/>
+                <w:sz w:val="18"/>
+                <w:szCs w:val="18"/>
+              </w:rPr>
+            </w:pPr>
+          </w:p>
+          <w:p>
+            <w:pPr>
+              <w:jc w:val="both"/>
+              <w:rPr>
+                <w:rFonts w:ascii="Arial" w:hAnsi="Arial" w:cs="Arial"/>
+                <w:sz w:val="18"/>
+                <w:szCs w:val="18"/>
+                <w:vertAlign w:val="superscript"/>
+              </w:rPr>
+            </w:pPr>
+            <w:r>
+              <w:rPr>
+                <w:rFonts w:ascii="Arial" w:hAnsi="Arial" w:cs="Arial"/>
+                <w:b/>
+                <w:sz w:val="18"/>
+                <w:szCs w:val="18"/>
+              </w:rPr>
+              <w:t>Poder Executivo Estadual</w:t>
+            </w:r>
+          </w:p>
+          <w:p>
+            <w:pPr>
+              <w:jc w:val="both"/>
+              <w:rPr>
+                <w:rFonts w:ascii="Arial" w:hAnsi="Arial" w:cs="Arial"/>
+                <w:sz w:val="18"/>
+                <w:szCs w:val="18"/>
+                <w:vertAlign w:val="superscript"/>
+              </w:rPr>
+            </w:pPr>
+            <w:r>
+              <w:rPr>
+                <w:rFonts w:ascii="Arial" w:hAnsi="Arial" w:cs="Arial"/>
+                <w:b/>
+                <w:sz w:val="18"/>
+                <w:szCs w:val="18"/>
+              </w:rPr>
+              <w:t>C18:</w:t>
+            </w:r>
+            <w:r>
+              <w:rPr>
+                <w:rFonts w:ascii="Arial" w:hAnsi="Arial" w:cs="Arial"/>
+                <w:sz w:val="18"/>
+                <w:szCs w:val="18"/>
+              </w:rPr>
+              <w:t xml:space="preserve"> Decreto Estadual nº 47.278/2020, arts. 5º, XI e 6º, V e IN PRODERJ/PRE nº 07/2025, arts. 11 a 13, 17 e 18 e Anexo (itens 7.1, 8.1, 8.9.2.1, 8.14) — obrigatoriedade de inventário permanente de ativos e licenças, gestão de incidentes de segurança e SLA contratual no Poder Executivo Estadual.</w:t>
+            </w:r>
+          </w:p>
+          <w:p>
+            <w:pPr>
+              <w:jc w:val="both"/>
+              <w:rPr>
+                <w:rFonts w:ascii="Arial" w:eastAsia="Arial" w:hAnsi="Arial" w:cs="Arial"/>
+                <w:b/>
+                <w:bCs/>
+                <w:sz w:val="18"/>
+                <w:szCs w:val="18"/>
+              </w:rPr>
+            </w:pPr>
+          </w:p>
+          <w:p>
+            <w:pPr>
+              <w:jc w:val="both"/>
+              <w:rPr>
+                <w:rFonts w:ascii="Arial" w:hAnsi="Arial" w:cs="Arial"/>
+                <w:sz w:val="18"/>
+                <w:szCs w:val="18"/>
+                <w:vertAlign w:val="superscript"/>
+              </w:rPr>
+            </w:pPr>
+            <w:r>
+              <w:rPr>
+                <w:rFonts w:ascii="Arial" w:hAnsi="Arial" w:cs="Arial"/>
+                <w:b/>
+                <w:sz w:val="18"/>
+                <w:szCs w:val="18"/>
+              </w:rPr>
+              <w:t>Poder Judiciário Estadual</w:t>
+            </w:r>
+          </w:p>
+          <w:p>
+            <w:pPr>
+              <w:jc w:val="both"/>
+              <w:rPr>
+                <w:rFonts w:ascii="Arial" w:hAnsi="Arial" w:cs="Arial"/>
+                <w:sz w:val="18"/>
+                <w:szCs w:val="18"/>
+                <w:vertAlign w:val="superscript"/>
+              </w:rPr>
+            </w:pPr>
+            <w:r>
+              <w:rPr>
+                <w:rFonts w:ascii="Arial" w:hAnsi="Arial" w:cs="Arial"/>
+                <w:b/>
+                <w:sz w:val="18"/>
+                <w:szCs w:val="18"/>
+              </w:rPr>
+              <w:t>C19:</w:t>
+            </w:r>
+            <w:r>
+              <w:rPr>
+                <w:rFonts w:ascii="Arial" w:hAnsi="Arial" w:cs="Arial"/>
+                <w:sz w:val="18"/>
+                <w:szCs w:val="18"/>
+              </w:rPr>
+              <w:t xml:space="preserve"> Resolução CNJ nº 370/2021, arts. 18 a 21, 23 e 34, Resolução CNJ nº 396/2021, arts. 6º a 8º e Ato Normativo TJ nº 28/2022 — obrigatoriedade de catálogo de serviços de TIC, acordos de níveis de serviço com metas operacionais, inventário de ativos e gestão de incidentes no Poder Judiciário Estadual.</w:t>
+            </w:r>
+          </w:p>
+          <w:p>
+            <w:pPr>
+              <w:jc w:val="both"/>
+              <w:rPr>
+                <w:rFonts w:ascii="Arial" w:eastAsia="Arial" w:hAnsi="Arial" w:cs="Arial"/>
+                <w:b/>
+                <w:bCs/>
+                <w:sz w:val="18"/>
+                <w:szCs w:val="18"/>
+              </w:rPr>
+            </w:pPr>
+          </w:p>
+          <w:p>
+            <w:pPr>
+              <w:jc w:val="both"/>
+              <w:rPr>
+                <w:rFonts w:ascii="Arial" w:hAnsi="Arial" w:cs="Arial"/>
+                <w:sz w:val="18"/>
+                <w:szCs w:val="18"/>
+                <w:vertAlign w:val="superscript"/>
+              </w:rPr>
+            </w:pPr>
+            <w:r>
+              <w:rPr>
+                <w:rFonts w:ascii="Arial" w:hAnsi="Arial" w:cs="Arial"/>
+                <w:b/>
+                <w:sz w:val="18"/>
+                <w:szCs w:val="18"/>
+              </w:rPr>
+              <w:t>Ministério Público Estadual</w:t>
+            </w:r>
+          </w:p>
+          <w:p>
+            <w:pPr>
+              <w:jc w:val="both"/>
+              <w:rPr>
+                <w:rFonts w:ascii="Arial" w:hAnsi="Arial" w:cs="Arial"/>
+                <w:sz w:val="18"/>
+                <w:szCs w:val="18"/>
+                <w:vertAlign w:val="superscript"/>
+              </w:rPr>
+            </w:pPr>
+            <w:r>
+              <w:rPr>
+                <w:rFonts w:ascii="Arial" w:hAnsi="Arial" w:cs="Arial"/>
+                <w:b/>
+                <w:sz w:val="18"/>
+                <w:szCs w:val="18"/>
+              </w:rPr>
+              <w:t>C20:</w:t>
+            </w:r>
+            <w:r>
+              <w:rPr>
+                <w:rFonts w:ascii="Arial" w:hAnsi="Arial" w:cs="Arial"/>
+                <w:sz w:val="18"/>
+                <w:szCs w:val="18"/>
+              </w:rPr>
+              <w:t xml:space="preserve"> Resolução CNMP nº 171/2017, arts. 14, 23, 26, 27 e 28, Resolução CNMP nº 294/2024 e Resoluções GPGJ nº 2.785/2026 e nº 2.757/2025 — obrigatoriedade de catálogo de serviços, ANS, inventário permanente de ativos e gestão de incidentes de serviços e segurança no Ministério Público Estadual.</w:t>
+            </w:r>
+          </w:p>
         </w:tc>
         <w:tc>
           <w:tcPr>
@@ -4940,6 +7145,93 @@
                 <w:szCs w:val="18"/>
                 <w:u w:val="single"/>
               </w:rPr>
+              <w:t>Poder Executivo Estadual</w:t>
+            </w:r>
+            <w:r>
+              <w:rPr>
+                <w:rFonts w:ascii="Arial" w:hAnsi="Arial" w:cs="Arial"/>
+                <w:sz w:val="18"/>
+                <w:szCs w:val="18"/>
+              </w:rPr>
+              <w:t xml:space="preserve"> — Recomendação para que institua e mantenha atualizado catálogo de serviços de TIC, atentando-se, minimamente, em identificar os serviços efetivamente prestados, seus responsáveis, usuários, condições de acesso e informações necessárias ao atendimento das áreas demandantes [S5.1].</w:t>
+            </w:r>
+          </w:p>
+          <w:p>
+            <w:pPr>
+              <w:jc w:val="both"/>
+              <w:rPr>
+                <w:rFonts w:ascii="Arial" w:hAnsi="Arial" w:cs="Arial"/>
+                <w:sz w:val="18"/>
+                <w:szCs w:val="18"/>
+              </w:rPr>
+            </w:pPr>
+            <w:r>
+              <w:rPr>
+                <w:rFonts w:ascii="Arial" w:hAnsi="Arial" w:cs="Arial"/>
+                <w:b/>
+                <w:bCs/>
+                <w:sz w:val="18"/>
+                <w:szCs w:val="18"/>
+                <w:u w:val="single"/>
+              </w:rPr>
+              <w:t>Poder Judiciário Estadual</w:t>
+            </w:r>
+            <w:r>
+              <w:rPr>
+                <w:rFonts w:ascii="Arial" w:hAnsi="Arial" w:cs="Arial"/>
+                <w:sz w:val="18"/>
+                <w:szCs w:val="18"/>
+              </w:rPr>
+              <w:t xml:space="preserve"> — Determinação para que institua e mantenha atualizado catálogo de serviços de TIC, atentando-se, minimamente, em identificar os serviços efetivamente prestados, seus responsáveis, usuários, condições de acesso e informações necessárias ao atendimento das áreas demandantes [S5.1].</w:t>
+            </w:r>
+          </w:p>
+          <w:p>
+            <w:pPr>
+              <w:jc w:val="both"/>
+              <w:rPr>
+                <w:rFonts w:ascii="Arial" w:hAnsi="Arial" w:cs="Arial"/>
+                <w:sz w:val="18"/>
+                <w:szCs w:val="18"/>
+              </w:rPr>
+            </w:pPr>
+            <w:r>
+              <w:rPr>
+                <w:rFonts w:ascii="Arial" w:hAnsi="Arial" w:cs="Arial"/>
+                <w:b/>
+                <w:bCs/>
+                <w:sz w:val="18"/>
+                <w:szCs w:val="18"/>
+                <w:u w:val="single"/>
+              </w:rPr>
+              <w:t>Ministério Público Estadual</w:t>
+            </w:r>
+            <w:r>
+              <w:rPr>
+                <w:rFonts w:ascii="Arial" w:hAnsi="Arial" w:cs="Arial"/>
+                <w:sz w:val="18"/>
+                <w:szCs w:val="18"/>
+              </w:rPr>
+              <w:t xml:space="preserve"> — Determinação para que institua e mantenha atualizado catálogo de serviços de TIC, atentando-se, minimamente, em identificar os serviços efetivamente prestados, seus responsáveis, usuários, condições de acesso e informações necessárias ao atendimento das áreas demandantes [S5.1].</w:t>
+            </w:r>
+          </w:p>
+          <w:p>
+            <w:pPr>
+              <w:jc w:val="both"/>
+              <w:rPr>
+                <w:rFonts w:ascii="Arial" w:hAnsi="Arial" w:cs="Arial"/>
+                <w:sz w:val="18"/>
+                <w:szCs w:val="18"/>
+              </w:rPr>
+            </w:pPr>
+            <w:r>
+              <w:rPr>
+                <w:rFonts w:ascii="Arial" w:hAnsi="Arial" w:cs="Arial"/>
+                <w:b/>
+                <w:bCs/>
+                <w:sz w:val="18"/>
+                <w:szCs w:val="18"/>
+                <w:u w:val="single"/>
+              </w:rPr>
               <w:t>Comunicação com Recomendação</w:t>
             </w:r>
             <w:r>
@@ -4982,6 +7274,93 @@
                 <w:szCs w:val="18"/>
                 <w:u w:val="single"/>
               </w:rPr>
+              <w:t>Poder Executivo Estadual</w:t>
+            </w:r>
+            <w:r>
+              <w:rPr>
+                <w:rFonts w:ascii="Arial" w:hAnsi="Arial" w:cs="Arial"/>
+                <w:sz w:val="18"/>
+                <w:szCs w:val="18"/>
+              </w:rPr>
+              <w:t xml:space="preserve"> — Recomendação para que defina, acorde e monitore níveis de serviço para os serviços de TIC relevantes, estabelecendo metas e mecanismos de acompanhamento de seu cumprimento [S5.2].</w:t>
+            </w:r>
+          </w:p>
+          <w:p>
+            <w:pPr>
+              <w:jc w:val="both"/>
+              <w:rPr>
+                <w:rFonts w:ascii="Arial" w:hAnsi="Arial" w:cs="Arial"/>
+                <w:sz w:val="18"/>
+                <w:szCs w:val="18"/>
+              </w:rPr>
+            </w:pPr>
+            <w:r>
+              <w:rPr>
+                <w:rFonts w:ascii="Arial" w:hAnsi="Arial" w:cs="Arial"/>
+                <w:b/>
+                <w:bCs/>
+                <w:sz w:val="18"/>
+                <w:szCs w:val="18"/>
+                <w:u w:val="single"/>
+              </w:rPr>
+              <w:t>Poder Judiciário Estadual</w:t>
+            </w:r>
+            <w:r>
+              <w:rPr>
+                <w:rFonts w:ascii="Arial" w:hAnsi="Arial" w:cs="Arial"/>
+                <w:sz w:val="18"/>
+                <w:szCs w:val="18"/>
+              </w:rPr>
+              <w:t xml:space="preserve"> — Determinação para que defina, acorde e monitore níveis de serviço para os serviços de TIC relevantes, estabelecendo metas e mecanismos de acompanhamento de seu cumprimento [S5.2].</w:t>
+            </w:r>
+          </w:p>
+          <w:p>
+            <w:pPr>
+              <w:jc w:val="both"/>
+              <w:rPr>
+                <w:rFonts w:ascii="Arial" w:hAnsi="Arial" w:cs="Arial"/>
+                <w:sz w:val="18"/>
+                <w:szCs w:val="18"/>
+              </w:rPr>
+            </w:pPr>
+            <w:r>
+              <w:rPr>
+                <w:rFonts w:ascii="Arial" w:hAnsi="Arial" w:cs="Arial"/>
+                <w:b/>
+                <w:bCs/>
+                <w:sz w:val="18"/>
+                <w:szCs w:val="18"/>
+                <w:u w:val="single"/>
+              </w:rPr>
+              <w:t>Ministério Público Estadual</w:t>
+            </w:r>
+            <w:r>
+              <w:rPr>
+                <w:rFonts w:ascii="Arial" w:hAnsi="Arial" w:cs="Arial"/>
+                <w:sz w:val="18"/>
+                <w:szCs w:val="18"/>
+              </w:rPr>
+              <w:t xml:space="preserve"> — Determinação para que defina, acorde e monitore níveis de serviço para os serviços de TIC relevantes, estabelecendo metas e mecanismos de acompanhamento de seu cumprimento [S5.2].</w:t>
+            </w:r>
+          </w:p>
+          <w:p>
+            <w:pPr>
+              <w:jc w:val="both"/>
+              <w:rPr>
+                <w:rFonts w:ascii="Arial" w:hAnsi="Arial" w:cs="Arial"/>
+                <w:sz w:val="18"/>
+                <w:szCs w:val="18"/>
+              </w:rPr>
+            </w:pPr>
+            <w:r>
+              <w:rPr>
+                <w:rFonts w:ascii="Arial" w:hAnsi="Arial" w:cs="Arial"/>
+                <w:b/>
+                <w:bCs/>
+                <w:sz w:val="18"/>
+                <w:szCs w:val="18"/>
+                <w:u w:val="single"/>
+              </w:rPr>
               <w:t>Comunicação com Recomendação</w:t>
             </w:r>
             <w:r>
@@ -5024,6 +7403,93 @@
                 <w:szCs w:val="18"/>
                 <w:u w:val="single"/>
               </w:rPr>
+              <w:t>Poder Executivo Estadual</w:t>
+            </w:r>
+            <w:r>
+              <w:rPr>
+                <w:rFonts w:ascii="Arial" w:hAnsi="Arial" w:cs="Arial"/>
+                <w:sz w:val="18"/>
+                <w:szCs w:val="18"/>
+              </w:rPr>
+              <w:t xml:space="preserve"> — Determinação para que estabeleça e mantenha inventário atualizado dos ativos tecnológicos sob gestão da organização, contemplando, minimamente, os dispositivos e softwares utilizados, com informações suficientes para sua identificação e controle [S5.3].</w:t>
+            </w:r>
+          </w:p>
+          <w:p>
+            <w:pPr>
+              <w:jc w:val="both"/>
+              <w:rPr>
+                <w:rFonts w:ascii="Arial" w:hAnsi="Arial" w:cs="Arial"/>
+                <w:sz w:val="18"/>
+                <w:szCs w:val="18"/>
+              </w:rPr>
+            </w:pPr>
+            <w:r>
+              <w:rPr>
+                <w:rFonts w:ascii="Arial" w:hAnsi="Arial" w:cs="Arial"/>
+                <w:b/>
+                <w:bCs/>
+                <w:sz w:val="18"/>
+                <w:szCs w:val="18"/>
+                <w:u w:val="single"/>
+              </w:rPr>
+              <w:t>Poder Judiciário Estadual</w:t>
+            </w:r>
+            <w:r>
+              <w:rPr>
+                <w:rFonts w:ascii="Arial" w:hAnsi="Arial" w:cs="Arial"/>
+                <w:sz w:val="18"/>
+                <w:szCs w:val="18"/>
+              </w:rPr>
+              <w:t xml:space="preserve"> — Determinação para que estabeleça e mantenha inventário atualizado dos ativos tecnológicos sob gestão da organização, contemplando, minimamente, os dispositivos e softwares utilizados, com informações suficientes para sua identificação e controle [S5.3].</w:t>
+            </w:r>
+          </w:p>
+          <w:p>
+            <w:pPr>
+              <w:jc w:val="both"/>
+              <w:rPr>
+                <w:rFonts w:ascii="Arial" w:hAnsi="Arial" w:cs="Arial"/>
+                <w:sz w:val="18"/>
+                <w:szCs w:val="18"/>
+              </w:rPr>
+            </w:pPr>
+            <w:r>
+              <w:rPr>
+                <w:rFonts w:ascii="Arial" w:hAnsi="Arial" w:cs="Arial"/>
+                <w:b/>
+                <w:bCs/>
+                <w:sz w:val="18"/>
+                <w:szCs w:val="18"/>
+                <w:u w:val="single"/>
+              </w:rPr>
+              <w:t>Ministério Público Estadual</w:t>
+            </w:r>
+            <w:r>
+              <w:rPr>
+                <w:rFonts w:ascii="Arial" w:hAnsi="Arial" w:cs="Arial"/>
+                <w:sz w:val="18"/>
+                <w:szCs w:val="18"/>
+              </w:rPr>
+              <w:t xml:space="preserve"> — Determinação para que estabeleça e mantenha inventário atualizado dos ativos tecnológicos sob gestão da organização, contemplando, minimamente, os dispositivos e softwares utilizados, com informações suficientes para sua identificação e controle [S5.3].</w:t>
+            </w:r>
+          </w:p>
+          <w:p>
+            <w:pPr>
+              <w:jc w:val="both"/>
+              <w:rPr>
+                <w:rFonts w:ascii="Arial" w:hAnsi="Arial" w:cs="Arial"/>
+                <w:sz w:val="18"/>
+                <w:szCs w:val="18"/>
+              </w:rPr>
+            </w:pPr>
+            <w:r>
+              <w:rPr>
+                <w:rFonts w:ascii="Arial" w:hAnsi="Arial" w:cs="Arial"/>
+                <w:b/>
+                <w:bCs/>
+                <w:sz w:val="18"/>
+                <w:szCs w:val="18"/>
+                <w:u w:val="single"/>
+              </w:rPr>
               <w:t>Comunicação com Recomendação</w:t>
             </w:r>
             <w:r>
@@ -5066,6 +7532,93 @@
                 <w:szCs w:val="18"/>
                 <w:u w:val="single"/>
               </w:rPr>
+              <w:t>Poder Executivo Estadual</w:t>
+            </w:r>
+            <w:r>
+              <w:rPr>
+                <w:rFonts w:ascii="Arial" w:hAnsi="Arial" w:cs="Arial"/>
+                <w:sz w:val="18"/>
+                <w:szCs w:val="18"/>
+              </w:rPr>
+              <w:t xml:space="preserve"> — Recomendação para que formalize e execute processo de gestão de configuração, atentando-se, minimamente, em manter base, ferramenta ou registro equivalente com os itens de configuração relevantes, seus responsáveis e os relacionamentos entre ativos [S5.4].</w:t>
+            </w:r>
+          </w:p>
+          <w:p>
+            <w:pPr>
+              <w:jc w:val="both"/>
+              <w:rPr>
+                <w:rFonts w:ascii="Arial" w:hAnsi="Arial" w:cs="Arial"/>
+                <w:sz w:val="18"/>
+                <w:szCs w:val="18"/>
+              </w:rPr>
+            </w:pPr>
+            <w:r>
+              <w:rPr>
+                <w:rFonts w:ascii="Arial" w:hAnsi="Arial" w:cs="Arial"/>
+                <w:b/>
+                <w:bCs/>
+                <w:sz w:val="18"/>
+                <w:szCs w:val="18"/>
+                <w:u w:val="single"/>
+              </w:rPr>
+              <w:t>Poder Judiciário Estadual</w:t>
+            </w:r>
+            <w:r>
+              <w:rPr>
+                <w:rFonts w:ascii="Arial" w:hAnsi="Arial" w:cs="Arial"/>
+                <w:sz w:val="18"/>
+                <w:szCs w:val="18"/>
+              </w:rPr>
+              <w:t xml:space="preserve"> — Recomendação para que formalize e execute processo de gestão de configuração, atentando-se, minimamente, em manter base, ferramenta ou registro equivalente com os itens de configuração relevantes, seus responsáveis e os relacionamentos entre ativos [S5.4].</w:t>
+            </w:r>
+          </w:p>
+          <w:p>
+            <w:pPr>
+              <w:jc w:val="both"/>
+              <w:rPr>
+                <w:rFonts w:ascii="Arial" w:hAnsi="Arial" w:cs="Arial"/>
+                <w:sz w:val="18"/>
+                <w:szCs w:val="18"/>
+              </w:rPr>
+            </w:pPr>
+            <w:r>
+              <w:rPr>
+                <w:rFonts w:ascii="Arial" w:hAnsi="Arial" w:cs="Arial"/>
+                <w:b/>
+                <w:bCs/>
+                <w:sz w:val="18"/>
+                <w:szCs w:val="18"/>
+                <w:u w:val="single"/>
+              </w:rPr>
+              <w:t>Ministério Público Estadual</w:t>
+            </w:r>
+            <w:r>
+              <w:rPr>
+                <w:rFonts w:ascii="Arial" w:hAnsi="Arial" w:cs="Arial"/>
+                <w:sz w:val="18"/>
+                <w:szCs w:val="18"/>
+              </w:rPr>
+              <w:t xml:space="preserve"> — Recomendação para que formalize e execute processo de gestão de configuração, atentando-se, minimamente, em manter base, ferramenta ou registro equivalente com os itens de configuração relevantes, seus responsáveis e os relacionamentos entre ativos [S5.4].</w:t>
+            </w:r>
+          </w:p>
+          <w:p>
+            <w:pPr>
+              <w:jc w:val="both"/>
+              <w:rPr>
+                <w:rFonts w:ascii="Arial" w:hAnsi="Arial" w:cs="Arial"/>
+                <w:sz w:val="18"/>
+                <w:szCs w:val="18"/>
+              </w:rPr>
+            </w:pPr>
+            <w:r>
+              <w:rPr>
+                <w:rFonts w:ascii="Arial" w:hAnsi="Arial" w:cs="Arial"/>
+                <w:b/>
+                <w:bCs/>
+                <w:sz w:val="18"/>
+                <w:szCs w:val="18"/>
+                <w:u w:val="single"/>
+              </w:rPr>
               <w:t>Comunicação com Recomendação</w:t>
             </w:r>
             <w:r>
@@ -5075,6 +7628,93 @@
                 <w:szCs w:val="18"/>
               </w:rPr>
               <w:t xml:space="preserve"> para que formalize e execute processo de gestão de incidentes de TIC, atentando-se, minimamente, em definir papéis, critérios de priorização e escalamento, tratamento de incidentes de serviços e de segurança da informação e registro sistemático e rastreável das ocorrências [S5.5].</w:t>
+            </w:r>
+          </w:p>
+          <w:p>
+            <w:pPr>
+              <w:jc w:val="both"/>
+              <w:rPr>
+                <w:rFonts w:ascii="Arial" w:hAnsi="Arial" w:cs="Arial"/>
+                <w:sz w:val="18"/>
+                <w:szCs w:val="18"/>
+              </w:rPr>
+            </w:pPr>
+            <w:r>
+              <w:rPr>
+                <w:rFonts w:ascii="Arial" w:hAnsi="Arial" w:cs="Arial"/>
+                <w:b/>
+                <w:bCs/>
+                <w:sz w:val="18"/>
+                <w:szCs w:val="18"/>
+                <w:u w:val="single"/>
+              </w:rPr>
+              <w:t>Poder Executivo Estadual</w:t>
+            </w:r>
+            <w:r>
+              <w:rPr>
+                <w:rFonts w:ascii="Arial" w:hAnsi="Arial" w:cs="Arial"/>
+                <w:sz w:val="18"/>
+                <w:szCs w:val="18"/>
+              </w:rPr>
+              <w:t xml:space="preserve"> — Determinação para que formalize e execute processo de gestão de incidentes de TIC, atentando-se, minimamente, em definir papéis, critérios de priorização e escalamento, tratamento de incidentes de serviços e de segurança da informação e registro sistemático e rastreável das ocorrências [S5.5].</w:t>
+            </w:r>
+          </w:p>
+          <w:p>
+            <w:pPr>
+              <w:jc w:val="both"/>
+              <w:rPr>
+                <w:rFonts w:ascii="Arial" w:hAnsi="Arial" w:cs="Arial"/>
+                <w:sz w:val="18"/>
+                <w:szCs w:val="18"/>
+              </w:rPr>
+            </w:pPr>
+            <w:r>
+              <w:rPr>
+                <w:rFonts w:ascii="Arial" w:hAnsi="Arial" w:cs="Arial"/>
+                <w:b/>
+                <w:bCs/>
+                <w:sz w:val="18"/>
+                <w:szCs w:val="18"/>
+                <w:u w:val="single"/>
+              </w:rPr>
+              <w:t>Poder Judiciário Estadual</w:t>
+            </w:r>
+            <w:r>
+              <w:rPr>
+                <w:rFonts w:ascii="Arial" w:hAnsi="Arial" w:cs="Arial"/>
+                <w:sz w:val="18"/>
+                <w:szCs w:val="18"/>
+              </w:rPr>
+              <w:t xml:space="preserve"> — Determinação para que formalize e execute processo de gestão de incidentes de TIC, atentando-se, minimamente, em definir papéis, critérios de priorização e escalamento, tratamento de incidentes de serviços e de segurança da informação e registro sistemático e rastreável das ocorrências [S5.5].</w:t>
+            </w:r>
+          </w:p>
+          <w:p>
+            <w:pPr>
+              <w:jc w:val="both"/>
+              <w:rPr>
+                <w:rFonts w:ascii="Arial" w:hAnsi="Arial" w:cs="Arial"/>
+                <w:sz w:val="18"/>
+                <w:szCs w:val="18"/>
+              </w:rPr>
+            </w:pPr>
+            <w:r>
+              <w:rPr>
+                <w:rFonts w:ascii="Arial" w:hAnsi="Arial" w:cs="Arial"/>
+                <w:b/>
+                <w:bCs/>
+                <w:sz w:val="18"/>
+                <w:szCs w:val="18"/>
+                <w:u w:val="single"/>
+              </w:rPr>
+              <w:t>Ministério Público Estadual</w:t>
+            </w:r>
+            <w:r>
+              <w:rPr>
+                <w:rFonts w:ascii="Arial" w:hAnsi="Arial" w:cs="Arial"/>
+                <w:sz w:val="18"/>
+                <w:szCs w:val="18"/>
+              </w:rPr>
+              <w:t xml:space="preserve"> — Determinação para que formalize e execute processo de gestão de incidentes de TIC, atentando-se, minimamente, em definir papéis, critérios de priorização e escalamento, tratamento de incidentes de serviços e de segurança da informação e registro sistemático e rastreável das ocorrências [S5.5].</w:t>
             </w:r>
           </w:p>
         </w:tc>
@@ -5739,6 +8379,34 @@
             <w:pPr>
               <w:jc w:val="both"/>
               <w:rPr>
+                <w:rFonts w:ascii="Arial" w:hAnsi="Arial" w:cs="Arial"/>
+                <w:sz w:val="18"/>
+                <w:szCs w:val="18"/>
+                <w:vertAlign w:val="superscript"/>
+              </w:rPr>
+            </w:pPr>
+            <w:r>
+              <w:rPr>
+                <w:rFonts w:ascii="Arial" w:hAnsi="Arial" w:cs="Arial"/>
+                <w:b/>
+                <w:sz w:val="18"/>
+                <w:szCs w:val="18"/>
+              </w:rPr>
+              <w:t>C14:</w:t>
+            </w:r>
+            <w:r>
+              <w:rPr>
+                <w:rFonts w:ascii="Arial" w:hAnsi="Arial" w:cs="Arial"/>
+                <w:sz w:val="18"/>
+                <w:szCs w:val="18"/>
+              </w:rPr>
+              <w:t xml:space="preserve"> IN PRODERJ/PRE nº 05/2024, arts. 1º, 4º a 8º, 11 e 28, Decreto Estadual nº 47.278/2020, art. 7º e Decreto Estadual nº 48.749/2023 — rito de planejamento com DOD, ETP, Riscos e TR, aprovação prévia técnica da área de TIC, anuência do PRODERJ e vedação de contratação fora do PEDTIC e PCA no Poder Executivo Estadual.</w:t>
+            </w:r>
+          </w:p>
+          <w:p>
+            <w:pPr>
+              <w:jc w:val="both"/>
+              <w:rPr>
                 <w:rFonts w:ascii="Arial" w:eastAsia="Arial" w:hAnsi="Arial" w:cs="Arial"/>
                 <w:b/>
                 <w:bCs/>
@@ -5799,6 +8467,34 @@
             <w:pPr>
               <w:jc w:val="both"/>
               <w:rPr>
+                <w:rFonts w:ascii="Arial" w:hAnsi="Arial" w:cs="Arial"/>
+                <w:sz w:val="18"/>
+                <w:szCs w:val="18"/>
+                <w:vertAlign w:val="superscript"/>
+              </w:rPr>
+            </w:pPr>
+            <w:r>
+              <w:rPr>
+                <w:rFonts w:ascii="Arial" w:hAnsi="Arial" w:cs="Arial"/>
+                <w:b/>
+                <w:sz w:val="18"/>
+                <w:szCs w:val="18"/>
+              </w:rPr>
+              <w:t>C15:</w:t>
+            </w:r>
+            <w:r>
+              <w:rPr>
+                <w:rFonts w:ascii="Arial" w:hAnsi="Arial" w:cs="Arial"/>
+                <w:sz w:val="18"/>
+                <w:szCs w:val="18"/>
+              </w:rPr>
+              <w:t xml:space="preserve"> Resolução CNJ nº 468/2022, arts. 4º a 7º, 10, 11, 14, 15 e 29 e Ato Normativo TJ nº 27/2022, arts. 5º e 6º — rito de planejamento das contratações de TIC, alinhamento ao PDTIC/PAC e assinatura técnica obrigatória da área de TIC no Poder Judiciário Estadual.</w:t>
+            </w:r>
+          </w:p>
+          <w:p>
+            <w:pPr>
+              <w:jc w:val="both"/>
+              <w:rPr>
                 <w:rFonts w:ascii="Arial" w:eastAsia="Arial" w:hAnsi="Arial" w:cs="Arial"/>
                 <w:b/>
                 <w:bCs/>
@@ -5853,6 +8549,34 @@
                 <w:szCs w:val="18"/>
               </w:rPr>
               <w:t xml:space="preserve"> Resolução CNMP nº 283/2024, arts. 8º e 9º — a equipe de planejamento da contratação de solução de TIC deve ser instituída com integrante técnico, integrante requisitante e integrante administrativo.</w:t>
+            </w:r>
+          </w:p>
+          <w:p>
+            <w:pPr>
+              <w:jc w:val="both"/>
+              <w:rPr>
+                <w:rFonts w:ascii="Arial" w:hAnsi="Arial" w:cs="Arial"/>
+                <w:sz w:val="18"/>
+                <w:szCs w:val="18"/>
+                <w:vertAlign w:val="superscript"/>
+              </w:rPr>
+            </w:pPr>
+            <w:r>
+              <w:rPr>
+                <w:rFonts w:ascii="Arial" w:hAnsi="Arial" w:cs="Arial"/>
+                <w:b/>
+                <w:sz w:val="18"/>
+                <w:szCs w:val="18"/>
+              </w:rPr>
+              <w:t>C16:</w:t>
+            </w:r>
+            <w:r>
+              <w:rPr>
+                <w:rFonts w:ascii="Arial" w:hAnsi="Arial" w:cs="Arial"/>
+                <w:sz w:val="18"/>
+                <w:szCs w:val="18"/>
+              </w:rPr>
+              <w:t xml:space="preserve"> Resolução CNMP nº 283/2024, arts. 2º, 4º a 6º, 8º a 10, 16, 17, 20 e 33 e Resolução GPGJ nº 2.785/2026, art. 13, III — rito padronizado de contratação de TI, alinhamento ao PDTI/PAC e validação/subscrição técnica compulsória no Ministério Público Estadual.</w:t>
             </w:r>
           </w:p>
         </w:tc>
@@ -6205,6 +8929,93 @@
                 <w:szCs w:val="18"/>
                 <w:u w:val="single"/>
               </w:rPr>
+              <w:t>Poder Executivo Estadual</w:t>
+            </w:r>
+            <w:r>
+              <w:rPr>
+                <w:rFonts w:ascii="Arial" w:hAnsi="Arial" w:cs="Arial"/>
+                <w:sz w:val="18"/>
+                <w:szCs w:val="18"/>
+              </w:rPr>
+              <w:t xml:space="preserve"> — Determinação para que formalize e padronize o processo de planejamento das contratações de TIC, definindo etapas, responsabilidades e artefatos aplicáveis, podendo adotar modelos institucionais ou centralizados já existentes e prevendo fluxos proporcionais à natureza, complexidade e risco da contratação [S6.1].</w:t>
+            </w:r>
+          </w:p>
+          <w:p>
+            <w:pPr>
+              <w:jc w:val="both"/>
+              <w:rPr>
+                <w:rFonts w:ascii="Arial" w:hAnsi="Arial" w:cs="Arial"/>
+                <w:sz w:val="18"/>
+                <w:szCs w:val="18"/>
+              </w:rPr>
+            </w:pPr>
+            <w:r>
+              <w:rPr>
+                <w:rFonts w:ascii="Arial" w:hAnsi="Arial" w:cs="Arial"/>
+                <w:b/>
+                <w:bCs/>
+                <w:sz w:val="18"/>
+                <w:szCs w:val="18"/>
+                <w:u w:val="single"/>
+              </w:rPr>
+              <w:t>Poder Judiciário Estadual</w:t>
+            </w:r>
+            <w:r>
+              <w:rPr>
+                <w:rFonts w:ascii="Arial" w:hAnsi="Arial" w:cs="Arial"/>
+                <w:sz w:val="18"/>
+                <w:szCs w:val="18"/>
+              </w:rPr>
+              <w:t xml:space="preserve"> — Determinação para que formalize e padronize o processo de planejamento das contratações de TIC, definindo etapas, responsabilidades e artefatos aplicáveis, podendo adotar modelos institucionais ou centralizados já existentes e prevendo fluxos proporcionais à natureza, complexidade e risco da contratação [S6.1].</w:t>
+            </w:r>
+          </w:p>
+          <w:p>
+            <w:pPr>
+              <w:jc w:val="both"/>
+              <w:rPr>
+                <w:rFonts w:ascii="Arial" w:hAnsi="Arial" w:cs="Arial"/>
+                <w:sz w:val="18"/>
+                <w:szCs w:val="18"/>
+              </w:rPr>
+            </w:pPr>
+            <w:r>
+              <w:rPr>
+                <w:rFonts w:ascii="Arial" w:hAnsi="Arial" w:cs="Arial"/>
+                <w:b/>
+                <w:bCs/>
+                <w:sz w:val="18"/>
+                <w:szCs w:val="18"/>
+                <w:u w:val="single"/>
+              </w:rPr>
+              <w:t>Ministério Público Estadual</w:t>
+            </w:r>
+            <w:r>
+              <w:rPr>
+                <w:rFonts w:ascii="Arial" w:hAnsi="Arial" w:cs="Arial"/>
+                <w:sz w:val="18"/>
+                <w:szCs w:val="18"/>
+              </w:rPr>
+              <w:t xml:space="preserve"> — Determinação para que formalize e padronize o processo de planejamento das contratações de TIC, definindo etapas, responsabilidades e artefatos aplicáveis, podendo adotar modelos institucionais ou centralizados já existentes e prevendo fluxos proporcionais à natureza, complexidade e risco da contratação [S6.1].</w:t>
+            </w:r>
+          </w:p>
+          <w:p>
+            <w:pPr>
+              <w:jc w:val="both"/>
+              <w:rPr>
+                <w:rFonts w:ascii="Arial" w:hAnsi="Arial" w:cs="Arial"/>
+                <w:sz w:val="18"/>
+                <w:szCs w:val="18"/>
+              </w:rPr>
+            </w:pPr>
+            <w:r>
+              <w:rPr>
+                <w:rFonts w:ascii="Arial" w:hAnsi="Arial" w:cs="Arial"/>
+                <w:b/>
+                <w:bCs/>
+                <w:sz w:val="18"/>
+                <w:szCs w:val="18"/>
+                <w:u w:val="single"/>
+              </w:rPr>
               <w:t>Comunicação com Recomendação</w:t>
             </w:r>
             <w:r>
@@ -6247,6 +9058,93 @@
                 <w:szCs w:val="18"/>
                 <w:u w:val="single"/>
               </w:rPr>
+              <w:t>Poder Executivo Estadual</w:t>
+            </w:r>
+            <w:r>
+              <w:rPr>
+                <w:rFonts w:ascii="Arial" w:hAnsi="Arial" w:cs="Arial"/>
+                <w:sz w:val="18"/>
+                <w:szCs w:val="18"/>
+              </w:rPr>
+              <w:t xml:space="preserve"> — Determinação para que estabeleça a submissão das contratações de TIC à análise prévia da área de TIC, de modo a verificar a compatibilidade da solução com os padrões tecnológicos, os requisitos institucionais e a arquitetura existente, admitindo procedimentos simplificados e proporcionais à natureza, ao risco e ao valor da contratação, preservada análise técnica compatível [S6.2].</w:t>
+            </w:r>
+          </w:p>
+          <w:p>
+            <w:pPr>
+              <w:jc w:val="both"/>
+              <w:rPr>
+                <w:rFonts w:ascii="Arial" w:hAnsi="Arial" w:cs="Arial"/>
+                <w:sz w:val="18"/>
+                <w:szCs w:val="18"/>
+              </w:rPr>
+            </w:pPr>
+            <w:r>
+              <w:rPr>
+                <w:rFonts w:ascii="Arial" w:hAnsi="Arial" w:cs="Arial"/>
+                <w:b/>
+                <w:bCs/>
+                <w:sz w:val="18"/>
+                <w:szCs w:val="18"/>
+                <w:u w:val="single"/>
+              </w:rPr>
+              <w:t>Poder Judiciário Estadual</w:t>
+            </w:r>
+            <w:r>
+              <w:rPr>
+                <w:rFonts w:ascii="Arial" w:hAnsi="Arial" w:cs="Arial"/>
+                <w:sz w:val="18"/>
+                <w:szCs w:val="18"/>
+              </w:rPr>
+              <w:t xml:space="preserve"> — Determinação para que estabeleça a submissão das contratações de TIC à análise prévia da área de TIC, de modo a verificar a compatibilidade da solução com os padrões tecnológicos, os requisitos institucionais e a arquitetura existente, admitindo procedimentos simplificados e proporcionais à natureza, ao risco e ao valor da contratação, preservada análise técnica compatível [S6.2].</w:t>
+            </w:r>
+          </w:p>
+          <w:p>
+            <w:pPr>
+              <w:jc w:val="both"/>
+              <w:rPr>
+                <w:rFonts w:ascii="Arial" w:hAnsi="Arial" w:cs="Arial"/>
+                <w:sz w:val="18"/>
+                <w:szCs w:val="18"/>
+              </w:rPr>
+            </w:pPr>
+            <w:r>
+              <w:rPr>
+                <w:rFonts w:ascii="Arial" w:hAnsi="Arial" w:cs="Arial"/>
+                <w:b/>
+                <w:bCs/>
+                <w:sz w:val="18"/>
+                <w:szCs w:val="18"/>
+                <w:u w:val="single"/>
+              </w:rPr>
+              <w:t>Ministério Público Estadual</w:t>
+            </w:r>
+            <w:r>
+              <w:rPr>
+                <w:rFonts w:ascii="Arial" w:hAnsi="Arial" w:cs="Arial"/>
+                <w:sz w:val="18"/>
+                <w:szCs w:val="18"/>
+              </w:rPr>
+              <w:t xml:space="preserve"> — Determinação para que estabeleça a submissão das contratações de TIC à análise prévia da área de TIC, de modo a verificar a compatibilidade da solução com os padrões tecnológicos, os requisitos institucionais e a arquitetura existente, admitindo procedimentos simplificados e proporcionais à natureza, ao risco e ao valor da contratação, preservada análise técnica compatível [S6.2].</w:t>
+            </w:r>
+          </w:p>
+          <w:p>
+            <w:pPr>
+              <w:jc w:val="both"/>
+              <w:rPr>
+                <w:rFonts w:ascii="Arial" w:hAnsi="Arial" w:cs="Arial"/>
+                <w:sz w:val="18"/>
+                <w:szCs w:val="18"/>
+              </w:rPr>
+            </w:pPr>
+            <w:r>
+              <w:rPr>
+                <w:rFonts w:ascii="Arial" w:hAnsi="Arial" w:cs="Arial"/>
+                <w:b/>
+                <w:bCs/>
+                <w:sz w:val="18"/>
+                <w:szCs w:val="18"/>
+                <w:u w:val="single"/>
+              </w:rPr>
               <w:t>Comunicação com Determinação</w:t>
             </w:r>
             <w:r>
@@ -6270,6 +9168,93 @@
                 <w:u w:val="single"/>
               </w:rPr>
             </w:pPr>
+          </w:p>
+          <w:p>
+            <w:pPr>
+              <w:jc w:val="both"/>
+              <w:rPr>
+                <w:rFonts w:ascii="Arial" w:hAnsi="Arial" w:cs="Arial"/>
+                <w:sz w:val="18"/>
+                <w:szCs w:val="18"/>
+              </w:rPr>
+            </w:pPr>
+            <w:r>
+              <w:rPr>
+                <w:rFonts w:ascii="Arial" w:hAnsi="Arial" w:cs="Arial"/>
+                <w:b/>
+                <w:bCs/>
+                <w:sz w:val="18"/>
+                <w:szCs w:val="18"/>
+                <w:u w:val="single"/>
+              </w:rPr>
+              <w:t>Poder Executivo Estadual</w:t>
+            </w:r>
+            <w:r>
+              <w:rPr>
+                <w:rFonts w:ascii="Arial" w:hAnsi="Arial" w:cs="Arial"/>
+                <w:sz w:val="18"/>
+                <w:szCs w:val="18"/>
+              </w:rPr>
+              <w:t xml:space="preserve"> — Determinação para que assegure que as contratações de TIC sejam compatíveis com os instrumentos de planejamento de TIC e, quando elaborado, com o Plano de Contratações Anual, promovendo os ajustes ou justificativas cabíveis nos casos excepcionais [S6.3].</w:t>
+            </w:r>
+          </w:p>
+          <w:p>
+            <w:pPr>
+              <w:jc w:val="both"/>
+              <w:rPr>
+                <w:rFonts w:ascii="Arial" w:hAnsi="Arial" w:cs="Arial"/>
+                <w:sz w:val="18"/>
+                <w:szCs w:val="18"/>
+              </w:rPr>
+            </w:pPr>
+            <w:r>
+              <w:rPr>
+                <w:rFonts w:ascii="Arial" w:hAnsi="Arial" w:cs="Arial"/>
+                <w:b/>
+                <w:bCs/>
+                <w:sz w:val="18"/>
+                <w:szCs w:val="18"/>
+                <w:u w:val="single"/>
+              </w:rPr>
+              <w:t>Poder Judiciário Estadual</w:t>
+            </w:r>
+            <w:r>
+              <w:rPr>
+                <w:rFonts w:ascii="Arial" w:hAnsi="Arial" w:cs="Arial"/>
+                <w:sz w:val="18"/>
+                <w:szCs w:val="18"/>
+              </w:rPr>
+              <w:t xml:space="preserve"> — Determinação para que assegure que as contratações de TIC sejam compatíveis com os instrumentos de planejamento de TIC e, quando elaborado, com o Plano de Contratações Anual, promovendo os ajustes ou justificativas cabíveis nos casos excepcionais [S6.3].</w:t>
+            </w:r>
+          </w:p>
+          <w:p>
+            <w:pPr>
+              <w:jc w:val="both"/>
+              <w:rPr>
+                <w:rFonts w:ascii="Arial" w:hAnsi="Arial" w:cs="Arial"/>
+                <w:sz w:val="18"/>
+                <w:szCs w:val="18"/>
+              </w:rPr>
+            </w:pPr>
+            <w:r>
+              <w:rPr>
+                <w:rFonts w:ascii="Arial" w:hAnsi="Arial" w:cs="Arial"/>
+                <w:b/>
+                <w:bCs/>
+                <w:sz w:val="18"/>
+                <w:szCs w:val="18"/>
+                <w:u w:val="single"/>
+              </w:rPr>
+              <w:t>Ministério Público Estadual</w:t>
+            </w:r>
+            <w:r>
+              <w:rPr>
+                <w:rFonts w:ascii="Arial" w:hAnsi="Arial" w:cs="Arial"/>
+                <w:sz w:val="18"/>
+                <w:szCs w:val="18"/>
+              </w:rPr>
+              <w:t xml:space="preserve"> — Determinação para que assegure que as contratações de TIC sejam compatíveis com os instrumentos de planejamento de TIC e, quando elaborado, com o Plano de Contratações Anual, promovendo os ajustes ou justificativas cabíveis nos casos excepcionais [S6.3].</w:t>
+            </w:r>
           </w:p>
           <w:p>
             <w:pPr>
@@ -6727,7 +9712,7 @@
               <w:sz w:val="18"/>
               <w:szCs w:val="18"/>
             </w:rPr>
-            <w:t>: 113 organizações públicas estaduais e municipais respondentes do iGovTI 2026.</w:t>
+            <w:t>: 119 organizações públicas estaduais e prefeituras municipais</w:t>
           </w:r>
         </w:p>
         <w:p>
@@ -6756,7 +9741,7 @@
               <w:sz w:val="18"/>
               <w:szCs w:val="18"/>
             </w:rPr>
-            <w:t>: Avaliar o grau de adoção das organizações públicas às boas práticas de governança e gestão de tecnologia da informação, mediante aplicação do iGovTI 2026.</w:t>
+            <w:t>: Avaliar o grau de adoção dos jurisdicionados às boas práticas de governança e gestão de TI.</w:t>
           </w:r>
         </w:p>
       </w:tc>

</xml_diff>